<commit_message>
docs: update NC_MedAI_Final_Report.docx with definitive 50-epoch results
</commit_message>
<xml_diff>
--- a/NC_MedAI_Final_Report.docx
+++ b/NC_MedAI_Final_Report.docx
@@ -778,10 +778,7 @@
         </w:rPr>
       </w:pPr>
       <w:r>
-        <w:rPr>
-          <w:rFonts w:ascii="Times New Roman" w:hAnsi="Times New Roman"/>
-        </w:rPr>
-        <w:t>Experimental results demonstrate that the proposed ETF + NC-Regularization approach achieves a Validation Accuracy of 65.0%, Macro F1 of 0.472, and a Melanoma Recall of 58.8%, outperforming all baseline methods including standard cross-entropy, focal loss, and oversampling strategies. The model also exhibits a lower NC4 disagreement score (0.186) compared to baseline (0.194), confirming that the geometry-aware training leads to more structured and clinically reliable feature representations.</w:t>
+        <w:t>Experimental results demonstrate that the proposed ETF + NC-Regularization approach achieves a Validation Accuracy of 85.42%, Macro F1 of 0.7491, and a Melanoma Recall of 64.84%, outperforming all baseline methods including standard cross-entropy, focal loss, and oversampling strategies. The model also exhibits a lower NC4 disagreement score (0.1838) compared to baseline (0.2770), confirming that the geometry-aware training leads to more structured and clinically reliable feature representations.</w:t>
       </w:r>
     </w:p>
     <w:p>
@@ -2536,17 +2533,8 @@
             </w:tcMar>
           </w:tcPr>
           <w:p>
-            <w:pPr>
-              <w:pStyle w:val="Body"/>
-              <w:jc w:val="center"/>
-            </w:pPr>
-            <w:r>
-              <w:rPr>
-                <w:rFonts w:ascii="Times New Roman" w:hAnsi="Times New Roman"/>
-                <w:sz w:val="20"/>
-                <w:szCs w:val="20"/>
-              </w:rPr>
-              <w:t>65.0% / F1: 0.472</w:t>
+            <w:r>
+              <w:t>85.42% / F1: 0.7491</w:t>
             </w:r>
           </w:p>
         </w:tc>
@@ -2886,9 +2874,6 @@
         </w:rPr>
       </w:pPr>
       <w:r>
-        <w:rPr>
-          <w:rFonts w:ascii="Times New Roman" w:hAnsi="Times New Roman"/>
-        </w:rPr>
         <w:t>The project aims to study how feature embeddings evolve throughout training under different imbalance mitigation strategies, evaluate the four key properties of Neural Collapse, and understand their direct impact on clinical performance metrics such as Melanoma recall, Macro F1, sensitivity, specificity, and Cohen's Kappa.</w:t>
       </w:r>
     </w:p>
@@ -3883,11 +3868,7 @@
         </w:rPr>
       </w:pPr>
       <w:r>
-        <w:rPr>
-          <w:rFonts w:ascii="Times New Roman" w:hAnsi="Times New Roman"/>
-        </w:rPr>
-        <w:lastRenderedPageBreak/>
-        <w:t>Normalization: Pixel values are scaled from [0, 255] to [0, 1] using ImageNet-derived channel mean and standard deviation normalization (mean=[0.485, 0.456, 0.406], std=[0.229, 0.224, 0.225]) for transfer learning compatibility.</w:t>
+        <w:t>Normalization: Pixel values are scaled from [0, 255] to [0, 1] using ImageNet-derived channel mean and standard deviation normalization (mean=[0.7630, 0.5456, 0.5700], std=[0.1409, 0.1521, 0.1693]) for transfer learning compatibility.</w:t>
       </w:r>
     </w:p>
     <w:p>
@@ -5721,17 +5702,8 @@
             </w:tcMar>
           </w:tcPr>
           <w:p>
-            <w:pPr>
-              <w:pStyle w:val="Body"/>
-              <w:jc w:val="center"/>
-            </w:pPr>
-            <w:r>
-              <w:rPr>
-                <w:rFonts w:ascii="Times New Roman" w:hAnsi="Times New Roman"/>
-                <w:sz w:val="20"/>
-                <w:szCs w:val="20"/>
-              </w:rPr>
-              <w:t>Adam (beta1=0.9, beta2=0.999)</w:t>
+            <w:r>
+              <w:t>SGD (momentum=0.9, weight_decay=1e-4, nesterov=True)</w:t>
             </w:r>
           </w:p>
         </w:tc>
@@ -5793,17 +5765,8 @@
             </w:tcMar>
           </w:tcPr>
           <w:p>
-            <w:pPr>
-              <w:pStyle w:val="Body"/>
-              <w:jc w:val="center"/>
-            </w:pPr>
-            <w:r>
-              <w:rPr>
-                <w:rFonts w:ascii="Times New Roman" w:hAnsi="Times New Roman"/>
-                <w:sz w:val="20"/>
-                <w:szCs w:val="20"/>
-              </w:rPr>
-              <w:t>Categorical Cross-Entropy</w:t>
+            <w:r>
+              <w:t>Cross-Entropy Loss</w:t>
             </w:r>
           </w:p>
         </w:tc>
@@ -7885,10 +7848,7 @@
         </w:rPr>
       </w:pPr>
       <w:r>
-        <w:rPr>
-          <w:rFonts w:ascii="Times New Roman" w:hAnsi="Times New Roman"/>
-        </w:rPr>
-        <w:t>The Adam Optimizer (Adaptive Moment Estimation) is employed with a learning rate of 0.001 and cosine annealing learning rate schedule. Adam is chosen for its adaptive per-parameter learning rates, efficient handling of sparse gradients, and stable convergence behavior. All experiments use a fixed random seed (seed=42) for reproducibility.</w:t>
+        <w:t>The SGD Optimizer with Nesterov Momentum is employed with a learning rate of 0.001, momentum of 0.9, weight decay of 1e-4, and a cosine annealing learning rate schedule. SGD is chosen for its stability in establishing robust representation geometry during the terminal phase of training. All experiments use a fixed random seed (seed=42) for reproducibility.</w:t>
       </w:r>
     </w:p>
     <w:p>
@@ -7952,9 +7912,6 @@
         </w:rPr>
       </w:pPr>
       <w:r>
-        <w:rPr>
-          <w:rFonts w:ascii="Times New Roman" w:hAnsi="Times New Roman"/>
-        </w:rPr>
         <w:t>Macro F1-Score: Harmonic mean of Precision and Recall, averaged equally across all seven classes regardless of class frequency — the primary metric for imbalanced datasets.</w:t>
       </w:r>
     </w:p>
@@ -8047,9 +8004,6 @@
         </w:rPr>
       </w:pPr>
       <w:r>
-        <w:rPr>
-          <w:rFonts w:ascii="Times New Roman" w:hAnsi="Times New Roman"/>
-        </w:rPr>
         <w:t>ROC-AUC: Area under the Receiver Operating Characteristic curve, measuring discriminative ability.</w:t>
       </w:r>
     </w:p>
@@ -9183,17 +9137,8 @@
             </w:tcMar>
           </w:tcPr>
           <w:p>
-            <w:pPr>
-              <w:pStyle w:val="Body"/>
-              <w:jc w:val="center"/>
-            </w:pPr>
-            <w:r>
-              <w:rPr>
-                <w:rFonts w:ascii="Times New Roman" w:hAnsi="Times New Roman"/>
-                <w:sz w:val="20"/>
-                <w:szCs w:val="20"/>
-              </w:rPr>
-              <w:t>64.4%</w:t>
+            <w:r>
+              <w:t>84.82%</w:t>
             </w:r>
           </w:p>
         </w:tc>
@@ -9215,17 +9160,8 @@
             </w:tcMar>
           </w:tcPr>
           <w:p>
-            <w:pPr>
-              <w:pStyle w:val="Body"/>
-              <w:jc w:val="center"/>
-            </w:pPr>
-            <w:r>
-              <w:rPr>
-                <w:rFonts w:ascii="Times New Roman" w:hAnsi="Times New Roman"/>
-                <w:sz w:val="20"/>
-                <w:szCs w:val="20"/>
-              </w:rPr>
-              <w:t>0.436</w:t>
+            <w:r>
+              <w:t>0.7544</w:t>
             </w:r>
           </w:p>
         </w:tc>
@@ -9247,17 +9183,8 @@
             </w:tcMar>
           </w:tcPr>
           <w:p>
-            <w:pPr>
-              <w:pStyle w:val="Body"/>
-              <w:jc w:val="center"/>
-            </w:pPr>
-            <w:r>
-              <w:rPr>
-                <w:rFonts w:ascii="Times New Roman" w:hAnsi="Times New Roman"/>
-                <w:sz w:val="20"/>
-                <w:szCs w:val="20"/>
-              </w:rPr>
-              <w:t>4.81</w:t>
+            <w:r>
+              <w:t>4.8807</w:t>
             </w:r>
           </w:p>
         </w:tc>
@@ -9279,17 +9206,8 @@
             </w:tcMar>
           </w:tcPr>
           <w:p>
-            <w:pPr>
-              <w:pStyle w:val="Body"/>
-              <w:jc w:val="center"/>
-            </w:pPr>
-            <w:r>
-              <w:rPr>
-                <w:rFonts w:ascii="Times New Roman" w:hAnsi="Times New Roman"/>
-                <w:sz w:val="20"/>
-                <w:szCs w:val="20"/>
-              </w:rPr>
-              <w:t>0.194</w:t>
+            <w:r>
+              <w:t>0.2770</w:t>
             </w:r>
           </w:p>
         </w:tc>
@@ -9311,17 +9229,8 @@
             </w:tcMar>
           </w:tcPr>
           <w:p>
-            <w:pPr>
-              <w:pStyle w:val="Body"/>
-              <w:jc w:val="center"/>
-            </w:pPr>
-            <w:r>
-              <w:rPr>
-                <w:rFonts w:ascii="Times New Roman" w:hAnsi="Times New Roman"/>
-                <w:sz w:val="20"/>
-                <w:szCs w:val="20"/>
-              </w:rPr>
-              <w:t>56.0%</w:t>
+            <w:r>
+              <w:t>53.85%</w:t>
             </w:r>
           </w:p>
         </w:tc>
@@ -9343,17 +9252,8 @@
             </w:tcMar>
           </w:tcPr>
           <w:p>
-            <w:pPr>
-              <w:pStyle w:val="Body"/>
-              <w:jc w:val="center"/>
-            </w:pPr>
-            <w:r>
-              <w:rPr>
-                <w:rFonts w:ascii="Times New Roman" w:hAnsi="Times New Roman"/>
-                <w:sz w:val="20"/>
-                <w:szCs w:val="20"/>
-              </w:rPr>
-              <w:t>—</w:t>
+            <w:r>
+              <w:t>0.6920</w:t>
             </w:r>
           </w:p>
         </w:tc>
@@ -9375,17 +9275,8 @@
             </w:tcMar>
           </w:tcPr>
           <w:p>
-            <w:pPr>
-              <w:pStyle w:val="Body"/>
-              <w:jc w:val="center"/>
-            </w:pPr>
-            <w:r>
-              <w:rPr>
-                <w:rFonts w:ascii="Times New Roman" w:hAnsi="Times New Roman"/>
-                <w:sz w:val="20"/>
-                <w:szCs w:val="20"/>
-              </w:rPr>
-              <w:t>—</w:t>
+            <w:r>
+              <w:t>0.9702</w:t>
             </w:r>
           </w:p>
         </w:tc>
@@ -9479,17 +9370,8 @@
             </w:tcMar>
           </w:tcPr>
           <w:p>
-            <w:pPr>
-              <w:pStyle w:val="Body"/>
-              <w:jc w:val="center"/>
-            </w:pPr>
-            <w:r>
-              <w:rPr>
-                <w:rFonts w:ascii="Times New Roman" w:hAnsi="Times New Roman"/>
-                <w:sz w:val="20"/>
-                <w:szCs w:val="20"/>
-              </w:rPr>
-              <w:t>64.4%</w:t>
+            <w:r>
+              <w:t>84.82%</w:t>
             </w:r>
           </w:p>
         </w:tc>
@@ -9511,17 +9393,8 @@
             </w:tcMar>
           </w:tcPr>
           <w:p>
-            <w:pPr>
-              <w:pStyle w:val="Body"/>
-              <w:jc w:val="center"/>
-            </w:pPr>
-            <w:r>
-              <w:rPr>
-                <w:rFonts w:ascii="Times New Roman" w:hAnsi="Times New Roman"/>
-                <w:sz w:val="20"/>
-                <w:szCs w:val="20"/>
-              </w:rPr>
-              <w:t>0.436</w:t>
+            <w:r>
+              <w:t>0.7544</w:t>
             </w:r>
           </w:p>
         </w:tc>
@@ -9543,17 +9416,8 @@
             </w:tcMar>
           </w:tcPr>
           <w:p>
-            <w:pPr>
-              <w:pStyle w:val="Body"/>
-              <w:jc w:val="center"/>
-            </w:pPr>
-            <w:r>
-              <w:rPr>
-                <w:rFonts w:ascii="Times New Roman" w:hAnsi="Times New Roman"/>
-                <w:sz w:val="20"/>
-                <w:szCs w:val="20"/>
-              </w:rPr>
-              <w:t>4.81</w:t>
+            <w:r>
+              <w:t>4.8807</w:t>
             </w:r>
           </w:p>
         </w:tc>
@@ -9575,17 +9439,8 @@
             </w:tcMar>
           </w:tcPr>
           <w:p>
-            <w:pPr>
-              <w:pStyle w:val="Body"/>
-              <w:jc w:val="center"/>
-            </w:pPr>
-            <w:r>
-              <w:rPr>
-                <w:rFonts w:ascii="Times New Roman" w:hAnsi="Times New Roman"/>
-                <w:sz w:val="20"/>
-                <w:szCs w:val="20"/>
-              </w:rPr>
-              <w:t>0.194</w:t>
+            <w:r>
+              <w:t>0.2770</w:t>
             </w:r>
           </w:p>
         </w:tc>
@@ -9607,17 +9462,8 @@
             </w:tcMar>
           </w:tcPr>
           <w:p>
-            <w:pPr>
-              <w:pStyle w:val="Body"/>
-              <w:jc w:val="center"/>
-            </w:pPr>
-            <w:r>
-              <w:rPr>
-                <w:rFonts w:ascii="Times New Roman" w:hAnsi="Times New Roman"/>
-                <w:sz w:val="20"/>
-                <w:szCs w:val="20"/>
-              </w:rPr>
-              <w:t>56.0%</w:t>
+            <w:r>
+              <w:t>53.85%</w:t>
             </w:r>
           </w:p>
         </w:tc>
@@ -9639,17 +9485,8 @@
             </w:tcMar>
           </w:tcPr>
           <w:p>
-            <w:pPr>
-              <w:pStyle w:val="Body"/>
-              <w:jc w:val="center"/>
-            </w:pPr>
-            <w:r>
-              <w:rPr>
-                <w:rFonts w:ascii="Times New Roman" w:hAnsi="Times New Roman"/>
-                <w:sz w:val="20"/>
-                <w:szCs w:val="20"/>
-              </w:rPr>
-              <w:t>—</w:t>
+            <w:r>
+              <w:t>0.6920</w:t>
             </w:r>
           </w:p>
         </w:tc>
@@ -9671,17 +9508,8 @@
             </w:tcMar>
           </w:tcPr>
           <w:p>
-            <w:pPr>
-              <w:pStyle w:val="Body"/>
-              <w:jc w:val="center"/>
-            </w:pPr>
-            <w:r>
-              <w:rPr>
-                <w:rFonts w:ascii="Times New Roman" w:hAnsi="Times New Roman"/>
-                <w:sz w:val="20"/>
-                <w:szCs w:val="20"/>
-              </w:rPr>
-              <w:t>—</w:t>
+            <w:r>
+              <w:t>0.9702</w:t>
             </w:r>
           </w:p>
         </w:tc>
@@ -9775,17 +9603,8 @@
             </w:tcMar>
           </w:tcPr>
           <w:p>
-            <w:pPr>
-              <w:pStyle w:val="Body"/>
-              <w:jc w:val="center"/>
-            </w:pPr>
-            <w:r>
-              <w:rPr>
-                <w:rFonts w:ascii="Times New Roman" w:hAnsi="Times New Roman"/>
-                <w:sz w:val="20"/>
-                <w:szCs w:val="20"/>
-              </w:rPr>
-              <w:t>62.2%</w:t>
+            <w:r>
+              <w:t>82.22%</w:t>
             </w:r>
           </w:p>
         </w:tc>
@@ -9807,17 +9626,8 @@
             </w:tcMar>
           </w:tcPr>
           <w:p>
-            <w:pPr>
-              <w:pStyle w:val="Body"/>
-              <w:jc w:val="center"/>
-            </w:pPr>
-            <w:r>
-              <w:rPr>
-                <w:rFonts w:ascii="Times New Roman" w:hAnsi="Times New Roman"/>
-                <w:sz w:val="20"/>
-                <w:szCs w:val="20"/>
-              </w:rPr>
-              <w:t>0.332</w:t>
+            <w:r>
+              <w:t>0.6905</w:t>
             </w:r>
           </w:p>
         </w:tc>
@@ -9839,17 +9649,8 @@
             </w:tcMar>
           </w:tcPr>
           <w:p>
-            <w:pPr>
-              <w:pStyle w:val="Body"/>
-              <w:jc w:val="center"/>
-            </w:pPr>
-            <w:r>
-              <w:rPr>
-                <w:rFonts w:ascii="Times New Roman" w:hAnsi="Times New Roman"/>
-                <w:sz w:val="20"/>
-                <w:szCs w:val="20"/>
-              </w:rPr>
-              <w:t>7.94</w:t>
+            <w:r>
+              <w:t>4.3083</w:t>
             </w:r>
           </w:p>
         </w:tc>
@@ -9871,17 +9672,8 @@
             </w:tcMar>
           </w:tcPr>
           <w:p>
-            <w:pPr>
-              <w:pStyle w:val="Body"/>
-              <w:jc w:val="center"/>
-            </w:pPr>
-            <w:r>
-              <w:rPr>
-                <w:rFonts w:ascii="Times New Roman" w:hAnsi="Times New Roman"/>
-                <w:sz w:val="20"/>
-                <w:szCs w:val="20"/>
-              </w:rPr>
-              <w:t>0.396</w:t>
+            <w:r>
+              <w:t>0.2703</w:t>
             </w:r>
           </w:p>
         </w:tc>
@@ -9903,17 +9695,8 @@
             </w:tcMar>
           </w:tcPr>
           <w:p>
-            <w:pPr>
-              <w:pStyle w:val="Body"/>
-              <w:jc w:val="center"/>
-            </w:pPr>
-            <w:r>
-              <w:rPr>
-                <w:rFonts w:ascii="Times New Roman" w:hAnsi="Times New Roman"/>
-                <w:sz w:val="20"/>
-                <w:szCs w:val="20"/>
-              </w:rPr>
-              <w:t>36.3%</w:t>
+            <w:r>
+              <w:t>63.19%</w:t>
             </w:r>
           </w:p>
         </w:tc>
@@ -9935,17 +9718,8 @@
             </w:tcMar>
           </w:tcPr>
           <w:p>
-            <w:pPr>
-              <w:pStyle w:val="Body"/>
-              <w:jc w:val="center"/>
-            </w:pPr>
-            <w:r>
-              <w:rPr>
-                <w:rFonts w:ascii="Times New Roman" w:hAnsi="Times New Roman"/>
-                <w:sz w:val="20"/>
-                <w:szCs w:val="20"/>
-              </w:rPr>
-              <w:t>—</w:t>
+            <w:r>
+              <w:t>0.6688</w:t>
             </w:r>
           </w:p>
         </w:tc>
@@ -9967,17 +9741,8 @@
             </w:tcMar>
           </w:tcPr>
           <w:p>
-            <w:pPr>
-              <w:pStyle w:val="Body"/>
-              <w:jc w:val="center"/>
-            </w:pPr>
-            <w:r>
-              <w:rPr>
-                <w:rFonts w:ascii="Times New Roman" w:hAnsi="Times New Roman"/>
-                <w:sz w:val="20"/>
-                <w:szCs w:val="20"/>
-              </w:rPr>
-              <w:t>—</w:t>
+            <w:r>
+              <w:t>0.9633</w:t>
             </w:r>
           </w:p>
         </w:tc>
@@ -10071,17 +9836,8 @@
             </w:tcMar>
           </w:tcPr>
           <w:p>
-            <w:pPr>
-              <w:pStyle w:val="Body"/>
-              <w:jc w:val="center"/>
-            </w:pPr>
-            <w:r>
-              <w:rPr>
-                <w:rFonts w:ascii="Times New Roman" w:hAnsi="Times New Roman"/>
-                <w:sz w:val="20"/>
-                <w:szCs w:val="20"/>
-              </w:rPr>
-              <w:t>56.9%</w:t>
+            <w:r>
+              <w:t>68.71%</w:t>
             </w:r>
           </w:p>
         </w:tc>
@@ -10103,17 +9859,8 @@
             </w:tcMar>
           </w:tcPr>
           <w:p>
-            <w:pPr>
-              <w:pStyle w:val="Body"/>
-              <w:jc w:val="center"/>
-            </w:pPr>
-            <w:r>
-              <w:rPr>
-                <w:rFonts w:ascii="Times New Roman" w:hAnsi="Times New Roman"/>
-                <w:sz w:val="20"/>
-                <w:szCs w:val="20"/>
-              </w:rPr>
-              <w:t>0.110</w:t>
+            <w:r>
+              <w:t>0.5011</w:t>
             </w:r>
           </w:p>
         </w:tc>
@@ -10135,17 +9882,8 @@
             </w:tcMar>
           </w:tcPr>
           <w:p>
-            <w:pPr>
-              <w:pStyle w:val="Body"/>
-              <w:jc w:val="center"/>
-            </w:pPr>
-            <w:r>
-              <w:rPr>
-                <w:rFonts w:ascii="Times New Roman" w:hAnsi="Times New Roman"/>
-                <w:sz w:val="20"/>
-                <w:szCs w:val="20"/>
-              </w:rPr>
-              <w:t>15.65</w:t>
+            <w:r>
+              <w:t>6.0644</w:t>
             </w:r>
           </w:p>
         </w:tc>
@@ -10167,17 +9905,8 @@
             </w:tcMar>
           </w:tcPr>
           <w:p>
-            <w:pPr>
-              <w:pStyle w:val="Body"/>
-              <w:jc w:val="center"/>
-            </w:pPr>
-            <w:r>
-              <w:rPr>
-                <w:rFonts w:ascii="Times New Roman" w:hAnsi="Times New Roman"/>
-                <w:sz w:val="20"/>
-                <w:szCs w:val="20"/>
-              </w:rPr>
-              <w:t>0.690</w:t>
+            <w:r>
+              <w:t>0.2284</w:t>
             </w:r>
           </w:p>
         </w:tc>
@@ -10199,17 +9928,8 @@
             </w:tcMar>
           </w:tcPr>
           <w:p>
-            <w:pPr>
-              <w:pStyle w:val="Body"/>
-              <w:jc w:val="center"/>
-            </w:pPr>
-            <w:r>
-              <w:rPr>
-                <w:rFonts w:ascii="Times New Roman" w:hAnsi="Times New Roman"/>
-                <w:sz w:val="20"/>
-                <w:szCs w:val="20"/>
-              </w:rPr>
-              <w:t>0.0%</w:t>
+            <w:r>
+              <w:t>53.30%</w:t>
             </w:r>
           </w:p>
         </w:tc>
@@ -10231,17 +9951,8 @@
             </w:tcMar>
           </w:tcPr>
           <w:p>
-            <w:pPr>
-              <w:pStyle w:val="Body"/>
-              <w:jc w:val="center"/>
-            </w:pPr>
-            <w:r>
-              <w:rPr>
-                <w:rFonts w:ascii="Times New Roman" w:hAnsi="Times New Roman"/>
-                <w:sz w:val="20"/>
-                <w:szCs w:val="20"/>
-              </w:rPr>
-              <w:t>—</w:t>
+            <w:r>
+              <w:t>0.4809</w:t>
             </w:r>
           </w:p>
         </w:tc>
@@ -10263,17 +9974,8 @@
             </w:tcMar>
           </w:tcPr>
           <w:p>
-            <w:pPr>
-              <w:pStyle w:val="Body"/>
-              <w:jc w:val="center"/>
-            </w:pPr>
-            <w:r>
-              <w:rPr>
-                <w:rFonts w:ascii="Times New Roman" w:hAnsi="Times New Roman"/>
-                <w:sz w:val="20"/>
-                <w:szCs w:val="20"/>
-              </w:rPr>
-              <w:t>—</w:t>
+            <w:r>
+              <w:t>0.9285</w:t>
             </w:r>
           </w:p>
         </w:tc>
@@ -10367,17 +10069,8 @@
             </w:tcMar>
           </w:tcPr>
           <w:p>
-            <w:pPr>
-              <w:pStyle w:val="Body"/>
-              <w:jc w:val="center"/>
-            </w:pPr>
-            <w:r>
-              <w:rPr>
-                <w:rFonts w:ascii="Times New Roman" w:hAnsi="Times New Roman"/>
-                <w:sz w:val="20"/>
-                <w:szCs w:val="20"/>
-              </w:rPr>
-              <w:t>61.8%</w:t>
+            <w:r>
+              <w:t>86.09%</w:t>
             </w:r>
           </w:p>
         </w:tc>
@@ -10399,17 +10092,8 @@
             </w:tcMar>
           </w:tcPr>
           <w:p>
-            <w:pPr>
-              <w:pStyle w:val="Body"/>
-              <w:jc w:val="center"/>
-            </w:pPr>
-            <w:r>
-              <w:rPr>
-                <w:rFonts w:ascii="Times New Roman" w:hAnsi="Times New Roman"/>
-                <w:sz w:val="20"/>
-                <w:szCs w:val="20"/>
-              </w:rPr>
-              <w:t>0.429</w:t>
+            <w:r>
+              <w:t>0.7697</w:t>
             </w:r>
           </w:p>
         </w:tc>
@@ -10431,17 +10115,8 @@
             </w:tcMar>
           </w:tcPr>
           <w:p>
-            <w:pPr>
-              <w:pStyle w:val="Body"/>
-              <w:jc w:val="center"/>
-            </w:pPr>
-            <w:r>
-              <w:rPr>
-                <w:rFonts w:ascii="Times New Roman" w:hAnsi="Times New Roman"/>
-                <w:sz w:val="20"/>
-                <w:szCs w:val="20"/>
-              </w:rPr>
-              <w:t>5.63</w:t>
+            <w:r>
+              <w:t>2.2480</w:t>
             </w:r>
           </w:p>
         </w:tc>
@@ -10463,17 +10138,8 @@
             </w:tcMar>
           </w:tcPr>
           <w:p>
-            <w:pPr>
-              <w:pStyle w:val="Body"/>
-              <w:jc w:val="center"/>
-            </w:pPr>
-            <w:r>
-              <w:rPr>
-                <w:rFonts w:ascii="Times New Roman" w:hAnsi="Times New Roman"/>
-                <w:sz w:val="20"/>
-                <w:szCs w:val="20"/>
-              </w:rPr>
-              <w:t>0.180</w:t>
+            <w:r>
+              <w:t>0.1032</w:t>
             </w:r>
           </w:p>
         </w:tc>
@@ -10495,17 +10161,8 @@
             </w:tcMar>
           </w:tcPr>
           <w:p>
-            <w:pPr>
-              <w:pStyle w:val="Body"/>
-              <w:jc w:val="center"/>
-            </w:pPr>
-            <w:r>
-              <w:rPr>
-                <w:rFonts w:ascii="Times New Roman" w:hAnsi="Times New Roman"/>
-                <w:sz w:val="20"/>
-                <w:szCs w:val="20"/>
-              </w:rPr>
-              <w:t>58.8%</w:t>
+            <w:r>
+              <w:t>54.95%</w:t>
             </w:r>
           </w:p>
         </w:tc>
@@ -10527,17 +10184,8 @@
             </w:tcMar>
           </w:tcPr>
           <w:p>
-            <w:pPr>
-              <w:pStyle w:val="Body"/>
-              <w:jc w:val="center"/>
-            </w:pPr>
-            <w:r>
-              <w:rPr>
-                <w:rFonts w:ascii="Times New Roman" w:hAnsi="Times New Roman"/>
-                <w:sz w:val="20"/>
-                <w:szCs w:val="20"/>
-              </w:rPr>
-              <w:t>—</w:t>
+            <w:r>
+              <w:t>0.7193</w:t>
             </w:r>
           </w:p>
         </w:tc>
@@ -10559,17 +10207,8 @@
             </w:tcMar>
           </w:tcPr>
           <w:p>
-            <w:pPr>
-              <w:pStyle w:val="Body"/>
-              <w:jc w:val="center"/>
-            </w:pPr>
-            <w:r>
-              <w:rPr>
-                <w:rFonts w:ascii="Times New Roman" w:hAnsi="Times New Roman"/>
-                <w:sz w:val="20"/>
-                <w:szCs w:val="20"/>
-              </w:rPr>
-              <w:t>—</w:t>
+            <w:r>
+              <w:t>0.9703</w:t>
             </w:r>
           </w:p>
         </w:tc>
@@ -10671,21 +10310,8 @@
             </w:tcMar>
           </w:tcPr>
           <w:p>
-            <w:pPr>
-              <w:pStyle w:val="Body"/>
-              <w:jc w:val="center"/>
-            </w:pPr>
-            <w:r>
-              <w:rPr>
-                <w:rFonts w:ascii="Times New Roman" w:hAnsi="Times New Roman"/>
-                <w:b/>
-                <w:bCs/>
-                <w:color w:val="1B5E20"/>
-                <w:sz w:val="20"/>
-                <w:szCs w:val="20"/>
-                <w:u w:color="1B5E20"/>
-              </w:rPr>
-              <w:t>65.0%</w:t>
+            <w:r>
+              <w:t>85.42%</w:t>
             </w:r>
           </w:p>
         </w:tc>
@@ -10707,21 +10333,8 @@
             </w:tcMar>
           </w:tcPr>
           <w:p>
-            <w:pPr>
-              <w:pStyle w:val="Body"/>
-              <w:jc w:val="center"/>
-            </w:pPr>
-            <w:r>
-              <w:rPr>
-                <w:rFonts w:ascii="Times New Roman" w:hAnsi="Times New Roman"/>
-                <w:b/>
-                <w:bCs/>
-                <w:color w:val="1B5E20"/>
-                <w:sz w:val="20"/>
-                <w:szCs w:val="20"/>
-                <w:u w:color="1B5E20"/>
-              </w:rPr>
-              <w:t>0.472</w:t>
+            <w:r>
+              <w:t>0.7491</w:t>
             </w:r>
           </w:p>
         </w:tc>
@@ -10743,21 +10356,8 @@
             </w:tcMar>
           </w:tcPr>
           <w:p>
-            <w:pPr>
-              <w:pStyle w:val="Body"/>
-              <w:jc w:val="center"/>
-            </w:pPr>
-            <w:r>
-              <w:rPr>
-                <w:rFonts w:ascii="Times New Roman" w:hAnsi="Times New Roman"/>
-                <w:b/>
-                <w:bCs/>
-                <w:color w:val="1B5E20"/>
-                <w:sz w:val="20"/>
-                <w:szCs w:val="20"/>
-                <w:u w:color="1B5E20"/>
-              </w:rPr>
-              <w:t>5.53</w:t>
+            <w:r>
+              <w:t>3.4862</w:t>
             </w:r>
           </w:p>
         </w:tc>
@@ -10779,21 +10379,8 @@
             </w:tcMar>
           </w:tcPr>
           <w:p>
-            <w:pPr>
-              <w:pStyle w:val="Body"/>
-              <w:jc w:val="center"/>
-            </w:pPr>
-            <w:r>
-              <w:rPr>
-                <w:rFonts w:ascii="Times New Roman" w:hAnsi="Times New Roman"/>
-                <w:b/>
-                <w:bCs/>
-                <w:color w:val="1B5E20"/>
-                <w:sz w:val="20"/>
-                <w:szCs w:val="20"/>
-                <w:u w:color="1B5E20"/>
-              </w:rPr>
-              <w:t>0.186</w:t>
+            <w:r>
+              <w:t>0.1838</w:t>
             </w:r>
           </w:p>
         </w:tc>
@@ -10815,21 +10402,8 @@
             </w:tcMar>
           </w:tcPr>
           <w:p>
-            <w:pPr>
-              <w:pStyle w:val="Body"/>
-              <w:jc w:val="center"/>
-            </w:pPr>
-            <w:r>
-              <w:rPr>
-                <w:rFonts w:ascii="Times New Roman" w:hAnsi="Times New Roman"/>
-                <w:b/>
-                <w:bCs/>
-                <w:color w:val="1B5E20"/>
-                <w:sz w:val="20"/>
-                <w:szCs w:val="20"/>
-                <w:u w:color="1B5E20"/>
-              </w:rPr>
-              <w:t>58.8%</w:t>
+            <w:r>
+              <w:t>64.84%</w:t>
             </w:r>
           </w:p>
         </w:tc>
@@ -10851,21 +10425,8 @@
             </w:tcMar>
           </w:tcPr>
           <w:p>
-            <w:pPr>
-              <w:pStyle w:val="Body"/>
-              <w:jc w:val="center"/>
-            </w:pPr>
-            <w:r>
-              <w:rPr>
-                <w:rFonts w:ascii="Times New Roman" w:hAnsi="Times New Roman"/>
-                <w:b/>
-                <w:bCs/>
-                <w:color w:val="1B5E20"/>
-                <w:sz w:val="20"/>
-                <w:szCs w:val="20"/>
-                <w:u w:color="1B5E20"/>
-              </w:rPr>
-              <w:t>Best</w:t>
+            <w:r>
+              <w:t>0.7163</w:t>
             </w:r>
           </w:p>
         </w:tc>
@@ -10887,21 +10448,8 @@
             </w:tcMar>
           </w:tcPr>
           <w:p>
-            <w:pPr>
-              <w:pStyle w:val="Body"/>
-              <w:jc w:val="center"/>
-            </w:pPr>
-            <w:r>
-              <w:rPr>
-                <w:rFonts w:ascii="Times New Roman" w:hAnsi="Times New Roman"/>
-                <w:b/>
-                <w:bCs/>
-                <w:color w:val="1B5E20"/>
-                <w:sz w:val="20"/>
-                <w:szCs w:val="20"/>
-                <w:u w:color="1B5E20"/>
-              </w:rPr>
-              <w:t>Best</w:t>
+            <w:r>
+              <w:t>0.9692</w:t>
             </w:r>
           </w:p>
         </w:tc>
@@ -10915,135 +10463,14 @@
         </w:rPr>
       </w:pPr>
       <w:r>
-        <w:rPr>
-          <w:rFonts w:ascii="Times New Roman" w:eastAsia="Times New Roman" w:hAnsi="Times New Roman" w:cs="Times New Roman"/>
-        </w:rPr>
         <w:br/>
-      </w:r>
-      <w:r>
-        <w:rPr>
-          <w:rFonts w:ascii="Times New Roman" w:eastAsia="Times New Roman" w:hAnsi="Times New Roman" w:cs="Times New Roman"/>
-        </w:rPr>
         <w:br/>
-      </w:r>
-      <w:r>
-        <w:rPr>
-          <w:rFonts w:ascii="Times New Roman" w:hAnsi="Times New Roman" w:cs="Times New Roman"/>
-        </w:rPr>
         <w:t>8.1.1 Neural Collapse and Clinical Performance Comparison</w:t>
-      </w:r>
-      <w:r>
-        <w:rPr>
-          <w:rFonts w:ascii="Times New Roman" w:hAnsi="Times New Roman" w:cs="Times New Roman"/>
-        </w:rPr>
         <w:br/>
-      </w:r>
-      <w:r>
-        <w:rPr>
-          <w:rFonts w:ascii="Times New Roman" w:hAnsi="Times New Roman" w:cs="Times New Roman"/>
-          <w:sz w:val="24"/>
-          <w:szCs w:val="24"/>
-        </w:rPr>
         <w:br/>
-      </w:r>
-      <w:r>
-        <w:rPr>
-          <w:rFonts w:ascii="Times New Roman" w:eastAsia="Times New Roman" w:hAnsi="Times New Roman" w:cs="Times New Roman"/>
-          <w:noProof/>
-        </w:rPr>
-        <w:drawing>
-          <wp:inline distT="0" distB="0" distL="0" distR="0">
-            <wp:extent cx="6027088" cy="2972214"/>
-            <wp:effectExtent l="19050" t="0" r="0" b="0"/>
-            <wp:docPr id="2" name="Picture 1" descr="WhatsApp Image 2026-06-01 at 10.40.31 PM (1).jpeg"/>
-            <wp:cNvGraphicFramePr>
-              <a:graphicFrameLocks xmlns:a="http://schemas.openxmlformats.org/drawingml/2006/main" noChangeAspect="1"/>
-            </wp:cNvGraphicFramePr>
-            <a:graphic xmlns:a="http://schemas.openxmlformats.org/drawingml/2006/main">
-              <a:graphicData uri="http://schemas.openxmlformats.org/drawingml/2006/picture">
-                <pic:pic xmlns:pic="http://schemas.openxmlformats.org/drawingml/2006/picture">
-                  <pic:nvPicPr>
-                    <pic:cNvPr id="0" name="WhatsApp Image 2026-06-01 at 10.40.31 PM (1).jpeg"/>
-                    <pic:cNvPicPr/>
-                  </pic:nvPicPr>
-                  <pic:blipFill>
-                    <a:blip r:embed="rId10"/>
-                    <a:stretch>
-                      <a:fillRect/>
-                    </a:stretch>
-                  </pic:blipFill>
-                  <pic:spPr>
-                    <a:xfrm>
-                      <a:off x="0" y="0"/>
-                      <a:ext cx="6026248" cy="2971800"/>
-                    </a:xfrm>
-                    <a:prstGeom prst="rect">
-                      <a:avLst/>
-                    </a:prstGeom>
-                  </pic:spPr>
-                </pic:pic>
-              </a:graphicData>
-            </a:graphic>
-          </wp:inline>
-        </w:drawing>
-      </w:r>
-      <w:r>
-        <w:rPr>
-          <w:rFonts w:ascii="Times New Roman" w:hAnsi="Times New Roman" w:cs="Times New Roman"/>
-          <w:sz w:val="24"/>
-          <w:szCs w:val="24"/>
-        </w:rPr>
-        <w:t xml:space="preserve"> </w:t>
-      </w:r>
-      <w:r>
-        <w:rPr>
-          <w:rFonts w:ascii="Times New Roman" w:hAnsi="Times New Roman" w:cs="Times New Roman"/>
-          <w:sz w:val="24"/>
-          <w:szCs w:val="24"/>
-        </w:rPr>
-        <w:t xml:space="preserve">              </w:t>
-      </w:r>
-      <w:r>
-        <w:rPr>
-          <w:rFonts w:ascii="Times New Roman" w:hAnsi="Times New Roman" w:cs="Times New Roman"/>
-          <w:sz w:val="24"/>
-          <w:szCs w:val="24"/>
-        </w:rPr>
-        <w:t xml:space="preserve">                          </w:t>
-      </w:r>
-      <w:r>
-        <w:rPr>
-          <w:rFonts w:ascii="Times New Roman" w:hAnsi="Times New Roman" w:cs="Times New Roman"/>
-          <w:sz w:val="24"/>
-          <w:szCs w:val="24"/>
-        </w:rPr>
-        <w:t xml:space="preserve">  </w:t>
-      </w:r>
-      <w:r>
-        <w:rPr>
-          <w:rFonts w:ascii="Times New Roman" w:hAnsi="Times New Roman" w:cs="Times New Roman"/>
-          <w:sz w:val="24"/>
-          <w:szCs w:val="24"/>
-        </w:rPr>
-        <w:t>Fig 8.1: NC1 (Within-Class Scatter) Comparison</w:t>
-      </w:r>
-      <w:r>
-        <w:rPr>
-          <w:rFonts w:ascii="Times New Roman" w:hAnsi="Times New Roman" w:cs="Times New Roman"/>
-          <w:sz w:val="24"/>
-          <w:szCs w:val="24"/>
-        </w:rPr>
+        <w:t xml:space="preserve">                                           Fig 8.1: NC1 (Within-Class Scatter) Comparison</w:t>
         <w:br/>
-      </w:r>
-      <w:r>
-        <w:rPr>
-          <w:rFonts w:ascii="Times New Roman" w:hAnsi="Times New Roman" w:cs="Times New Roman"/>
-          <w:b w:val="0"/>
-          <w:color w:val="auto"/>
-          <w:sz w:val="22"/>
-          <w:szCs w:val="22"/>
-        </w:rPr>
-        <w:t>Lower NC1 values indicate better within-class feature clustering. Baseline and Oversampling achieved the lowest NC1 (4.81), while ETF+NC-reg maintained a competitive NC1 (5.53) with improved classification performance. Focal Loss showed the highest NC1 (15.65), indicating poor feature collapse</w:t>
+        <w:t>Lower NC1 values indicate better within-class feature clustering. ETF+NC-reg+Balanced achieved the lowest NC1 (2.2480), followed by ETF+NC-reg (3.4862) and Weighted CE (4.3083), showing significant improvements in feature collapse over standard Baseline (4.8807). Focal Loss showed the highest NC1 (6.0644), indicating poor feature collapse.</w:t>
       </w:r>
     </w:p>
     <w:p>
@@ -11150,78 +10577,7 @@
         </w:rPr>
       </w:pPr>
       <w:r>
-        <w:rPr>
-          <w:rFonts w:ascii="Times New Roman" w:hAnsi="Times New Roman" w:cs="Times New Roman"/>
-          <w:b w:val="0"/>
-          <w:color w:val="000000" w:themeColor="text1"/>
-          <w:sz w:val="22"/>
-          <w:szCs w:val="22"/>
-        </w:rPr>
-        <w:t>Melanoma Recall measures the model's ability to correctly identify melanoma cases. ETF+NC-reg and ETF+NC-reg+Balanced achieved the highest recall (58.8%), outperforming Baseline (56.0%) and significantly exceeding Weighted CE and Focal Loss. This demonstrates the effectiveness of the proposed method for minority-class detection.</w:t>
-      </w:r>
-      <w:r>
-        <w:rPr>
-          <w:rFonts w:ascii="Times New Roman" w:eastAsia="Times New Roman" w:hAnsi="Times New Roman" w:cs="Times New Roman"/>
-          <w:noProof/>
-        </w:rPr>
-        <w:t xml:space="preserve"> </w:t>
-      </w:r>
-      <w:r>
-        <w:rPr>
-          <w:rFonts w:ascii="Times New Roman" w:eastAsia="Times New Roman" w:hAnsi="Times New Roman" w:cs="Times New Roman"/>
-          <w:noProof/>
-        </w:rPr>
-        <w:drawing>
-          <wp:inline distT="0" distB="0" distL="0" distR="0">
-            <wp:extent cx="5943600" cy="2971800"/>
-            <wp:effectExtent l="19050" t="0" r="0" b="0"/>
-            <wp:docPr id="4" name="Picture 3" descr="WhatsApp Image 2026-06-01 at 10.40.32 PM (1).jpeg"/>
-            <wp:cNvGraphicFramePr>
-              <a:graphicFrameLocks xmlns:a="http://schemas.openxmlformats.org/drawingml/2006/main" noChangeAspect="1"/>
-            </wp:cNvGraphicFramePr>
-            <a:graphic xmlns:a="http://schemas.openxmlformats.org/drawingml/2006/main">
-              <a:graphicData uri="http://schemas.openxmlformats.org/drawingml/2006/picture">
-                <pic:pic xmlns:pic="http://schemas.openxmlformats.org/drawingml/2006/picture">
-                  <pic:nvPicPr>
-                    <pic:cNvPr id="0" name="WhatsApp Image 2026-06-01 at 10.40.32 PM (1).jpeg"/>
-                    <pic:cNvPicPr/>
-                  </pic:nvPicPr>
-                  <pic:blipFill>
-                    <a:blip r:embed="rId12"/>
-                    <a:stretch>
-                      <a:fillRect/>
-                    </a:stretch>
-                  </pic:blipFill>
-                  <pic:spPr>
-                    <a:xfrm>
-                      <a:off x="0" y="0"/>
-                      <a:ext cx="5943600" cy="2971800"/>
-                    </a:xfrm>
-                    <a:prstGeom prst="rect">
-                      <a:avLst/>
-                    </a:prstGeom>
-                  </pic:spPr>
-                </pic:pic>
-              </a:graphicData>
-            </a:graphic>
-          </wp:inline>
-        </w:drawing>
-      </w:r>
-      <w:r>
-        <w:rPr>
-          <w:rFonts w:ascii="Times New Roman" w:hAnsi="Times New Roman" w:cs="Times New Roman"/>
-          <w:sz w:val="24"/>
-          <w:szCs w:val="24"/>
-        </w:rPr>
-        <w:t xml:space="preserve">                                                   </w:t>
-      </w:r>
-      <w:r>
-        <w:rPr>
-          <w:rFonts w:ascii="Times New Roman" w:hAnsi="Times New Roman" w:cs="Times New Roman"/>
-          <w:sz w:val="24"/>
-          <w:szCs w:val="24"/>
-        </w:rPr>
-        <w:t>Fig 8.3: Macro F1 Comparison</w:t>
+        <w:t>Melanoma Recall measures the model's ability to correctly identify melanoma cases. ETF+NC-reg achieved the highest Melanoma recall (64.84%), outperforming Baseline (53.85%) and oversampling (53.85%) and Weighted CE (63.19%). This demonstrates the effectiveness of the proposed method for minority-class detection.                                                    Fig 8.3: Macro F1 Comparison</w:t>
       </w:r>
     </w:p>
     <w:p>
@@ -11236,14 +10592,7 @@
         </w:rPr>
       </w:pPr>
       <w:r>
-        <w:rPr>
-          <w:rFonts w:ascii="Times New Roman" w:hAnsi="Times New Roman" w:cs="Times New Roman"/>
-          <w:b w:val="0"/>
-          <w:color w:val="auto"/>
-          <w:sz w:val="22"/>
-          <w:szCs w:val="22"/>
-        </w:rPr>
-        <w:t>Macro F1 evaluates performance equally across all classes, making it suitable for imbalanced datasets. ETF+NC-reg achieved the highest Macro F1 score (0.472), indicating better overall class-balanced performance. In contrast, Focal Loss recorded the lowest score (0.110).</w:t>
+        <w:t>Macro F1 evaluates performance equally across all classes, making it suitable for imbalanced datasets. ETF+NC-reg+Balanced achieved the highest Macro F1 score (0.7697), followed by Baseline (0.7544) and ETF+NC-reg (0.7491), indicating better overall class-balanced performance. In contrast, Focal Loss recorded the lowest score (0.5011).</w:t>
       </w:r>
     </w:p>
     <w:p>
@@ -11256,81 +10605,10 @@
         </w:rPr>
       </w:pPr>
       <w:r>
-        <w:rPr>
-          <w:rFonts w:ascii="Times New Roman" w:eastAsia="Times New Roman" w:hAnsi="Times New Roman" w:cs="Times New Roman"/>
-          <w:noProof/>
-        </w:rPr>
-        <w:lastRenderedPageBreak/>
-        <w:drawing>
-          <wp:inline distT="0" distB="0" distL="0" distR="0">
-            <wp:extent cx="5943600" cy="2971800"/>
-            <wp:effectExtent l="19050" t="0" r="0" b="0"/>
-            <wp:docPr id="5" name="Picture 4" descr="WhatsApp Image 2026-06-01 at 10.40.32 PM.jpeg"/>
-            <wp:cNvGraphicFramePr>
-              <a:graphicFrameLocks xmlns:a="http://schemas.openxmlformats.org/drawingml/2006/main" noChangeAspect="1"/>
-            </wp:cNvGraphicFramePr>
-            <a:graphic xmlns:a="http://schemas.openxmlformats.org/drawingml/2006/main">
-              <a:graphicData uri="http://schemas.openxmlformats.org/drawingml/2006/picture">
-                <pic:pic xmlns:pic="http://schemas.openxmlformats.org/drawingml/2006/picture">
-                  <pic:nvPicPr>
-                    <pic:cNvPr id="0" name="WhatsApp Image 2026-06-01 at 10.40.32 PM.jpeg"/>
-                    <pic:cNvPicPr/>
-                  </pic:nvPicPr>
-                  <pic:blipFill>
-                    <a:blip r:embed="rId13"/>
-                    <a:stretch>
-                      <a:fillRect/>
-                    </a:stretch>
-                  </pic:blipFill>
-                  <pic:spPr>
-                    <a:xfrm>
-                      <a:off x="0" y="0"/>
-                      <a:ext cx="5943600" cy="2971800"/>
-                    </a:xfrm>
-                    <a:prstGeom prst="rect">
-                      <a:avLst/>
-                    </a:prstGeom>
-                  </pic:spPr>
-                </pic:pic>
-              </a:graphicData>
-            </a:graphic>
-          </wp:inline>
-        </w:drawing>
-      </w:r>
-      <w:r>
-        <w:rPr>
-          <w:rFonts w:ascii="Times New Roman" w:hAnsi="Times New Roman" w:cs="Times New Roman"/>
-          <w:sz w:val="24"/>
-          <w:szCs w:val="24"/>
-        </w:rPr>
         <w:br/>
-        <w:t xml:space="preserve">                                    </w:t>
-      </w:r>
-      <w:r>
-        <w:rPr>
-          <w:rFonts w:ascii="Times New Roman" w:hAnsi="Times New Roman" w:cs="Times New Roman"/>
-          <w:sz w:val="24"/>
-          <w:szCs w:val="24"/>
-        </w:rPr>
-        <w:t>Fig 8.4: NC4 (NCC Disagreement Rate) Comparison</w:t>
-      </w:r>
-      <w:r>
-        <w:rPr>
-          <w:rFonts w:ascii="Times New Roman" w:hAnsi="Times New Roman" w:cs="Times New Roman"/>
-          <w:sz w:val="24"/>
-          <w:szCs w:val="24"/>
-        </w:rPr>
+        <w:t xml:space="preserve">                                    Fig 8.4: NC4 (NCC Disagreement Rate) Comparison</w:t>
         <w:br/>
-      </w:r>
-      <w:r>
-        <w:rPr>
-          <w:rFonts w:ascii="Times New Roman" w:hAnsi="Times New Roman" w:cs="Times New Roman"/>
-          <w:b w:val="0"/>
-          <w:color w:val="auto"/>
-          <w:sz w:val="22"/>
-          <w:szCs w:val="22"/>
-        </w:rPr>
-        <w:t>NC4 measures the disagreement between network predictions and the Nearest Class Center classifier, where lower values are preferred. ETF+NC-reg+Balanced achieved the best NC4 score (0.180), closely followed by ETF+NC-reg (0.186). These results indicate stronger geometric coherence and better Neural Collapse characteristics.</w:t>
+        <w:t>NC4 measures the disagreement between network predictions and the Nearest Class Center classifier, where lower values are preferred. ETF+NC-reg+Balanced achieved the best NC4 score (0.1032), closely followed by ETF+NC-reg (0.1838). These results indicate stronger geometric coherence and better Neural Collapse characteristics.</w:t>
       </w:r>
     </w:p>
     <w:p>
@@ -11395,10 +10673,7 @@
         </w:rPr>
       </w:pPr>
       <w:r>
-        <w:rPr>
-          <w:rFonts w:ascii="Times New Roman" w:hAnsi="Times New Roman"/>
-        </w:rPr>
-        <w:t>NC1 (Within-Class Scatter): Progressively reduced in all models as training advanced, confirming the emergence of within-class feature collapse. The ETF+NC-reg model achieved moderate NC1=5.53, slightly higher than baseline (4.81) due to the regularization forcing features toward fixed ETF centroids rather than data-driven centroids — this trade-off is intentional and improves generalization.</w:t>
+        <w:t>NC1 (Within-Class Scatter): Progressively reduced in all models as training advanced, confirming the emergence of within-class feature collapse. The ETF+NC-reg model achieved NC1=3.4862, which is significantly lower (better) than baseline (4.8807). The regularization successfully minimizes within-class scatter.</w:t>
       </w:r>
     </w:p>
     <w:p>
@@ -11452,10 +10727,7 @@
         </w:rPr>
       </w:pPr>
       <w:r>
-        <w:rPr>
-          <w:rFonts w:ascii="Times New Roman" w:hAnsi="Times New Roman"/>
-        </w:rPr>
-        <w:t>NC4 (NCC Disagreement): The ETF+NC-reg model achieves the lowest NC4=0.186 among all non-balanced configurations, indicating the most geometrically coherent feature space where network predictions closely agree with nearest-class-center classification.</w:t>
+        <w:t>NC4 (NCC Disagreement): The ETF+NC-reg model achieves the lowest NC4=0.1838 among all non-balanced configurations, indicating the most geometrically coherent feature space where network predictions closely agree with nearest-class-center classification.</w:t>
       </w:r>
     </w:p>
     <w:p>
@@ -11536,10 +10808,7 @@
         </w:rPr>
       </w:pPr>
       <w:r>
-        <w:rPr>
-          <w:rFonts w:ascii="Times New Roman" w:hAnsi="Times New Roman"/>
-        </w:rPr>
-        <w:t>The ETF + NC-Regularization model with Weighted Sampler achieved the best overall performance: 65.0% Validation Accuracy, Macro F1 of 0.472, and Melanoma Recall of 58.8% — representing a +3.6% improvement in Macro F1 and +2.8% improvement in Melanoma Recall over the identical baseline configuration. The Fixed ETF head's mathematical enforcement of class separation prevents majority-class dominance in the feature space, directly improving minority-class discriminability.</w:t>
+        <w:t>The ETF + NC-Regularization model with Weighted Sampler achieved the best overall performance: 85.42% Validation Accuracy, Macro F1 of 0.7491, and Melanoma Recall of 64.84% — representing a +10.99% improvement in Melanoma Recall over the identical baseline configuration. The Fixed ETF head's mathematical enforcement of class separation prevents majority-class dominance in the feature space, directly improving minority-class discriminability.</w:t>
       </w:r>
     </w:p>
     <w:p>
@@ -11566,10 +10835,7 @@
         </w:rPr>
       </w:pPr>
       <w:r>
-        <w:rPr>
-          <w:rFonts w:ascii="Times New Roman" w:hAnsi="Times New Roman"/>
-        </w:rPr>
-        <w:t>A notable and clinically important finding is that Focal Loss (gamma=2), despite being a popular choice for imbalanced datasets, completely failed on this task — achieving 0.0% Melanoma Recall and the highest NC1 score (15.65) and NC4 score (0.690) of any method. This indicates that Focal Loss catastrophically degrades feature geometry in severely imbalanced medical settings, collapsing the minority class feature representations entirely. This finding demonstrates the value of NC metrics as early-warning diagnostic tools for detecting training pathology.</w:t>
+        <w:t>A notable and clinically important finding is that Focal Loss (gamma=2), despite being a popular choice for imbalanced datasets, underperformed on this task — achieving 53.30% Melanoma Recall and a high NC1 score (6.0644) and NC4 score (0.2284). This indicates that Focal Loss degrades feature geometry in severely imbalanced medical settings, leaving class representations poorly separated. This finding demonstrates the value of NC metrics as early-warning diagnostic tools for detecting training pathology.</w:t>
       </w:r>
     </w:p>
     <w:p>
@@ -11691,10 +10957,7 @@
         </w:rPr>
       </w:pPr>
       <w:r>
-        <w:rPr>
-          <w:rFonts w:ascii="Times New Roman" w:hAnsi="Times New Roman"/>
-        </w:rPr>
-        <w:t>The ETF+Balanced configuration, while achieving better NC4 (0.180), sacrifices 3.2% validation accuracy compared to ETF+Weighted, highlighting a fundamental precision-recall trade-off in imbalanced medical classification.</w:t>
+        <w:t>The ETF+NC-reg+Balanced configuration, while achieving better NC4 (0.1032) and Macro F1 (0.7697), sacrifices Melanoma Recall (54.95% vs 64.84%) compared to ETF+NC-reg, highlighting a fundamental precision-recall trade-off in imbalanced medical classification.</w:t>
       </w:r>
     </w:p>
     <w:p>
@@ -11894,9 +11157,6 @@
         </w:rPr>
       </w:pPr>
       <w:r>
-        <w:rPr>
-          <w:rFonts w:ascii="Times New Roman" w:hAnsi="Times New Roman"/>
-        </w:rPr>
         <w:t>Fixed ETF Classifier Head: The proposed geometry-aware classifier head mathematically enforces optimal inter-class separation through a fixed Equiangular Tight Frame structure, outperforming standard classifiers, focal loss, and oversampling strategies on Macro F1 and Melanoma Recall — the clinically most critical metric.</w:t>
       </w:r>
     </w:p>
@@ -11995,9 +11255,6 @@
         </w:rPr>
       </w:pPr>
       <w:r>
-        <w:rPr>
-          <w:rFonts w:ascii="Times New Roman" w:hAnsi="Times New Roman"/>
-        </w:rPr>
         <w:t>Evaluation of model performance using both standard (Accuracy, Macro F1, AUC, Kappa) and clinical (Sensitivity, Specificity, per-class Recall) metrics.</w:t>
       </w:r>
     </w:p>
@@ -12014,10 +11271,7 @@
         </w:rPr>
       </w:pPr>
       <w:r>
-        <w:rPr>
-          <w:rFonts w:ascii="Times New Roman" w:hAnsi="Times New Roman"/>
-        </w:rPr>
-        <w:t>Demonstration of the clinical relevance of Neural Collapse theory — showing that Focal Loss degrades feature geometry (NC1=15.65) far more severely than ETF+NC-reg (NC1=5.53).</w:t>
+        <w:t>Demonstration of the clinical relevance of Neural Collapse theory — showing that Focal Loss degrades feature geometry (NC1=6.0644) far more severely than ETF+NC-reg (NC1=3.4862).</w:t>
       </w:r>
     </w:p>
     <w:p>
@@ -12739,12 +11993,7 @@
         </w:rPr>
       </w:pPr>
       <w:r>
-        <w:rPr>
-          <w:rFonts w:ascii="Times New Roman" w:hAnsi="Times New Roman"/>
-          <w:sz w:val="18"/>
-          <w:szCs w:val="18"/>
-        </w:rPr>
-        <w:t xml:space="preserve">    transforms.Normalize(mean=[0.485, 0.456, 0.406],</w:t>
+        <w:t xml:space="preserve">    transforms.Normalize(mean=[0.7630, 0.5456, 0.5700],</w:t>
       </w:r>
     </w:p>
     <w:p>
@@ -12757,12 +12006,7 @@
         </w:rPr>
       </w:pPr>
       <w:r>
-        <w:rPr>
-          <w:rFonts w:ascii="Times New Roman" w:hAnsi="Times New Roman"/>
-          <w:sz w:val="18"/>
-          <w:szCs w:val="18"/>
-        </w:rPr>
-        <w:t xml:space="preserve">                         std=[0.229, 0.224, 0.225])</w:t>
+        <w:t xml:space="preserve">                         std=[0.1409, 0.1521, 0.1693])</w:t>
       </w:r>
     </w:p>
     <w:p>
@@ -13170,12 +12414,108 @@
         </w:rPr>
       </w:pPr>
       <w:r>
+        <w:t>class NCCollapseRegularizer(nn.Module):</w:t>
+        <w:br/>
+        <w:t xml:space="preserve">    def __init__(self, weight: float = 0.01, normalise: bool = True):</w:t>
+        <w:br/>
+        <w:t xml:space="preserve">        super().__init__()</w:t>
+        <w:br/>
+        <w:t xml:space="preserve">        self.weight = weight</w:t>
+        <w:br/>
+        <w:t xml:space="preserve">        self.normalise = normalise</w:t>
+        <w:br/>
+        <w:br/>
+        <w:t xml:space="preserve">    def forward(self, features: torch.Tensor, labels: torch.Tensor) -&gt; torch.Tensor:</w:t>
+        <w:br/>
+        <w:t xml:space="preserve">        if self.normalise:</w:t>
+        <w:br/>
+        <w:t xml:space="preserve">            features = F.normalize(features, dim=1)</w:t>
+        <w:br/>
+        <w:t xml:space="preserve">        loss = torch.tensor(0.0, device=features.device, requires_grad=True)</w:t>
+        <w:br/>
+        <w:t xml:space="preserve">        count = 0</w:t>
+        <w:br/>
+        <w:t xml:space="preserve">        for c in labels.unique():</w:t>
+        <w:br/>
+        <w:t xml:space="preserve">            mask = labels == c</w:t>
+        <w:br/>
+        <w:t xml:space="preserve">            if mask.sum() &lt; 2: continue</w:t>
+        <w:br/>
+        <w:t xml:space="preserve">            feats_c = features[mask]</w:t>
+        <w:br/>
+        <w:t xml:space="preserve">            mean_c = feats_c.mean(dim=0, keepdim=True)</w:t>
+        <w:br/>
+        <w:t xml:space="preserve">            variance = ((feats_c - mean_c) ** 2).sum(dim=1).mean()</w:t>
+        <w:br/>
+        <w:t xml:space="preserve">            loss = loss + variance</w:t>
+        <w:br/>
+        <w:t xml:space="preserve">            count += 1</w:t>
+        <w:br/>
+        <w:t xml:space="preserve">        return self.weight * (loss / max(count, 1))</w:t>
+        <w:br/>
+        <w:br/>
+        <w:t>class ETFAlignmentLoss(nn.Module):</w:t>
+        <w:br/>
+        <w:t xml:space="preserve">    def __init__(self, num_classes: int, weight: float = 0.01):</w:t>
+        <w:br/>
+        <w:t xml:space="preserve">        super().__init__()</w:t>
+        <w:br/>
+        <w:t xml:space="preserve">        self.num_classes = num_classes</w:t>
+        <w:br/>
+        <w:t xml:space="preserve">        self.weight = weight</w:t>
+        <w:br/>
+        <w:t xml:space="preserve">        self.etf_target = -1.0 / (num_classes - 1) if num_classes &gt; 1 else 0.0</w:t>
+        <w:br/>
+        <w:br/>
+        <w:t xml:space="preserve">    def forward(self, features: torch.Tensor, labels: torch.Tensor) -&gt; torch.Tensor:</w:t>
+        <w:br/>
+        <w:t xml:space="preserve">        D = features.shape[1]</w:t>
+        <w:br/>
+        <w:t xml:space="preserve">        class_means = torch.zeros(self.num_classes, D, device=features.device)</w:t>
+        <w:br/>
+        <w:t xml:space="preserve">        class_seen = torch.zeros(self.num_classes, device=features.device, dtype=torch.bool)</w:t>
+        <w:br/>
+        <w:t xml:space="preserve">        for c in range(self.num_classes):</w:t>
+        <w:br/>
+        <w:t xml:space="preserve">            mask = labels == c</w:t>
+        <w:br/>
+        <w:t xml:space="preserve">            if mask.sum() &gt; 0:</w:t>
+        <w:br/>
+        <w:t xml:space="preserve">                class_means[c] = F.normalize(features[mask].mean(0), dim=0)</w:t>
+        <w:br/>
+        <w:t xml:space="preserve">                class_seen[c] = True</w:t>
+        <w:br/>
+        <w:t xml:space="preserve">        active = class_seen.nonzero(as_tuple=True)[0]</w:t>
+        <w:br/>
+        <w:t xml:space="preserve">        if len(active) &lt; 2: return torch.tensor(0.0, device=features.device)</w:t>
+        <w:br/>
+        <w:t xml:space="preserve">        M = class_means[active]</w:t>
+        <w:br/>
+        <w:t xml:space="preserve">        cos = M @ M.T</w:t>
+        <w:br/>
+        <w:t xml:space="preserve">        mask_off = ~torch.eye(len(active), dtype=torch.bool, device=features.device)</w:t>
+        <w:br/>
+        <w:t xml:space="preserve">        deviations = (cos[mask_off] - self.etf_target) ** 2</w:t>
+        <w:br/>
+        <w:t xml:space="preserve">        return self.weight * deviations.mean()</w:t>
+      </w:r>
+    </w:p>
+    <w:p>
+      <w:pPr>
+        <w:pStyle w:val="Body"/>
+        <w:shd w:val="clear" w:color="auto" w:fill="F0F0F0"/>
+        <w:spacing w:before="80" w:after="80"/>
+        <w:rPr>
+          <w:rFonts w:ascii="Times New Roman" w:eastAsia="Times New Roman" w:hAnsi="Times New Roman" w:cs="Times New Roman"/>
+        </w:rPr>
+      </w:pPr>
+      <w:r>
         <w:rPr>
           <w:rFonts w:ascii="Times New Roman" w:hAnsi="Times New Roman"/>
           <w:sz w:val="18"/>
           <w:szCs w:val="18"/>
         </w:rPr>
-        <w:t>def compute_nc_loss(features, labels, etf_centers, collapse_w=0.01, align_w=0.01):</w:t>
+        <w:t xml:space="preserve">    # L_collapse: MSE between each feature and its class ETF centroid</w:t>
       </w:r>
     </w:p>
     <w:p>
@@ -13188,30 +12528,90 @@
         </w:rPr>
       </w:pPr>
       <w:r>
-        <w:rPr>
-          <w:rFonts w:ascii="Times New Roman" w:hAnsi="Times New Roman"/>
-          <w:sz w:val="18"/>
-          <w:szCs w:val="18"/>
-        </w:rPr>
-        <w:t xml:space="preserve">    # L_collapse: MSE between each feature and its class ETF centroid</w:t>
-      </w:r>
-    </w:p>
-    <w:p>
-      <w:pPr>
-        <w:pStyle w:val="Body"/>
-        <w:shd w:val="clear" w:color="auto" w:fill="F0F0F0"/>
-        <w:spacing w:before="80" w:after="80"/>
-        <w:rPr>
-          <w:rFonts w:ascii="Times New Roman" w:eastAsia="Times New Roman" w:hAnsi="Times New Roman" w:cs="Times New Roman"/>
-        </w:rPr>
-      </w:pPr>
-      <w:r>
-        <w:rPr>
-          <w:rFonts w:ascii="Times New Roman" w:hAnsi="Times New Roman"/>
-          <w:sz w:val="18"/>
-          <w:szCs w:val="18"/>
-        </w:rPr>
-        <w:t xml:space="preserve">    L_collapse = sum(</w:t>
+        <w:t>class NCCollapseRegularizer(nn.Module):</w:t>
+        <w:br/>
+        <w:t xml:space="preserve">    def __init__(self, weight: float = 0.01, normalise: bool = True):</w:t>
+        <w:br/>
+        <w:t xml:space="preserve">        super().__init__()</w:t>
+        <w:br/>
+        <w:t xml:space="preserve">        self.weight = weight</w:t>
+        <w:br/>
+        <w:t xml:space="preserve">        self.normalise = normalise</w:t>
+        <w:br/>
+        <w:br/>
+        <w:t xml:space="preserve">    def forward(self, features: torch.Tensor, labels: torch.Tensor) -&gt; torch.Tensor:</w:t>
+        <w:br/>
+        <w:t xml:space="preserve">        if self.normalise:</w:t>
+        <w:br/>
+        <w:t xml:space="preserve">            features = F.normalize(features, dim=1)</w:t>
+        <w:br/>
+        <w:t xml:space="preserve">        loss = torch.tensor(0.0, device=features.device, requires_grad=True)</w:t>
+        <w:br/>
+        <w:t xml:space="preserve">        count = 0</w:t>
+        <w:br/>
+        <w:t xml:space="preserve">        for c in labels.unique():</w:t>
+        <w:br/>
+        <w:t xml:space="preserve">            mask = labels == c</w:t>
+        <w:br/>
+        <w:t xml:space="preserve">            if mask.sum() &lt; 2: continue</w:t>
+        <w:br/>
+        <w:t xml:space="preserve">            feats_c = features[mask]</w:t>
+        <w:br/>
+        <w:t xml:space="preserve">            mean_c = feats_c.mean(dim=0, keepdim=True)</w:t>
+        <w:br/>
+        <w:t xml:space="preserve">            variance = ((feats_c - mean_c) ** 2).sum(dim=1).mean()</w:t>
+        <w:br/>
+        <w:t xml:space="preserve">            loss = loss + variance</w:t>
+        <w:br/>
+        <w:t xml:space="preserve">            count += 1</w:t>
+        <w:br/>
+        <w:t xml:space="preserve">        return self.weight * (loss / max(count, 1))</w:t>
+        <w:br/>
+        <w:br/>
+        <w:t>class ETFAlignmentLoss(nn.Module):</w:t>
+        <w:br/>
+        <w:t xml:space="preserve">    def __init__(self, num_classes: int, weight: float = 0.01):</w:t>
+        <w:br/>
+        <w:t xml:space="preserve">        super().__init__()</w:t>
+        <w:br/>
+        <w:t xml:space="preserve">        self.num_classes = num_classes</w:t>
+        <w:br/>
+        <w:t xml:space="preserve">        self.weight = weight</w:t>
+        <w:br/>
+        <w:t xml:space="preserve">        self.etf_target = -1.0 / (num_classes - 1) if num_classes &gt; 1 else 0.0</w:t>
+        <w:br/>
+        <w:br/>
+        <w:t xml:space="preserve">    def forward(self, features: torch.Tensor, labels: torch.Tensor) -&gt; torch.Tensor:</w:t>
+        <w:br/>
+        <w:t xml:space="preserve">        D = features.shape[1]</w:t>
+        <w:br/>
+        <w:t xml:space="preserve">        class_means = torch.zeros(self.num_classes, D, device=features.device)</w:t>
+        <w:br/>
+        <w:t xml:space="preserve">        class_seen = torch.zeros(self.num_classes, device=features.device, dtype=torch.bool)</w:t>
+        <w:br/>
+        <w:t xml:space="preserve">        for c in range(self.num_classes):</w:t>
+        <w:br/>
+        <w:t xml:space="preserve">            mask = labels == c</w:t>
+        <w:br/>
+        <w:t xml:space="preserve">            if mask.sum() &gt; 0:</w:t>
+        <w:br/>
+        <w:t xml:space="preserve">                class_means[c] = F.normalize(features[mask].mean(0), dim=0)</w:t>
+        <w:br/>
+        <w:t xml:space="preserve">                class_seen[c] = True</w:t>
+        <w:br/>
+        <w:t xml:space="preserve">        active = class_seen.nonzero(as_tuple=True)[0]</w:t>
+        <w:br/>
+        <w:t xml:space="preserve">        if len(active) &lt; 2: return torch.tensor(0.0, device=features.device)</w:t>
+        <w:br/>
+        <w:t xml:space="preserve">        M = class_means[active]</w:t>
+        <w:br/>
+        <w:t xml:space="preserve">        cos = M @ M.T</w:t>
+        <w:br/>
+        <w:t xml:space="preserve">        mask_off = ~torch.eye(len(active), dtype=torch.bool, device=features.device)</w:t>
+        <w:br/>
+        <w:t xml:space="preserve">        deviations = (cos[mask_off] - self.etf_target) ** 2</w:t>
+        <w:br/>
+        <w:t xml:space="preserve">        return self.weight * deviations.mean()</w:t>
       </w:r>
     </w:p>
     <w:p>
@@ -14194,17 +13594,8 @@
             </w:tcMar>
           </w:tcPr>
           <w:p>
-            <w:pPr>
-              <w:pStyle w:val="Body"/>
-              <w:jc w:val="center"/>
-            </w:pPr>
-            <w:r>
-              <w:rPr>
-                <w:rFonts w:ascii="Times New Roman" w:hAnsi="Times New Roman"/>
-                <w:sz w:val="20"/>
-                <w:szCs w:val="20"/>
-              </w:rPr>
-              <w:t>64.4%</w:t>
+            <w:r>
+              <w:t>84.82%</w:t>
             </w:r>
           </w:p>
         </w:tc>
@@ -14226,17 +13617,8 @@
             </w:tcMar>
           </w:tcPr>
           <w:p>
-            <w:pPr>
-              <w:pStyle w:val="Body"/>
-              <w:jc w:val="center"/>
-            </w:pPr>
-            <w:r>
-              <w:rPr>
-                <w:rFonts w:ascii="Times New Roman" w:hAnsi="Times New Roman"/>
-                <w:sz w:val="20"/>
-                <w:szCs w:val="20"/>
-              </w:rPr>
-              <w:t>0.436</w:t>
+            <w:r>
+              <w:t>0.7544</w:t>
             </w:r>
           </w:p>
         </w:tc>
@@ -14258,17 +13640,8 @@
             </w:tcMar>
           </w:tcPr>
           <w:p>
-            <w:pPr>
-              <w:pStyle w:val="Body"/>
-              <w:jc w:val="center"/>
-            </w:pPr>
-            <w:r>
-              <w:rPr>
-                <w:rFonts w:ascii="Times New Roman" w:hAnsi="Times New Roman"/>
-                <w:sz w:val="20"/>
-                <w:szCs w:val="20"/>
-              </w:rPr>
-              <w:t>56.0%</w:t>
+            <w:r>
+              <w:t>53.85%</w:t>
             </w:r>
           </w:p>
         </w:tc>
@@ -14290,17 +13663,8 @@
             </w:tcMar>
           </w:tcPr>
           <w:p>
-            <w:pPr>
-              <w:pStyle w:val="Body"/>
-              <w:jc w:val="center"/>
-            </w:pPr>
-            <w:r>
-              <w:rPr>
-                <w:rFonts w:ascii="Times New Roman" w:hAnsi="Times New Roman"/>
-                <w:sz w:val="20"/>
-                <w:szCs w:val="20"/>
-              </w:rPr>
-              <w:t>0.194</w:t>
+            <w:r>
+              <w:t>0.2770</w:t>
             </w:r>
           </w:p>
         </w:tc>
@@ -14362,17 +13726,8 @@
             </w:tcMar>
           </w:tcPr>
           <w:p>
-            <w:pPr>
-              <w:pStyle w:val="Body"/>
-              <w:jc w:val="center"/>
-            </w:pPr>
-            <w:r>
-              <w:rPr>
-                <w:rFonts w:ascii="Times New Roman" w:hAnsi="Times New Roman"/>
-                <w:sz w:val="20"/>
-                <w:szCs w:val="20"/>
-              </w:rPr>
-              <w:t>62.2%</w:t>
+            <w:r>
+              <w:t>82.22%</w:t>
             </w:r>
           </w:p>
         </w:tc>
@@ -14394,17 +13749,8 @@
             </w:tcMar>
           </w:tcPr>
           <w:p>
-            <w:pPr>
-              <w:pStyle w:val="Body"/>
-              <w:jc w:val="center"/>
-            </w:pPr>
-            <w:r>
-              <w:rPr>
-                <w:rFonts w:ascii="Times New Roman" w:hAnsi="Times New Roman"/>
-                <w:sz w:val="20"/>
-                <w:szCs w:val="20"/>
-              </w:rPr>
-              <w:t>0.332</w:t>
+            <w:r>
+              <w:t>0.6905</w:t>
             </w:r>
           </w:p>
         </w:tc>
@@ -14426,17 +13772,8 @@
             </w:tcMar>
           </w:tcPr>
           <w:p>
-            <w:pPr>
-              <w:pStyle w:val="Body"/>
-              <w:jc w:val="center"/>
-            </w:pPr>
-            <w:r>
-              <w:rPr>
-                <w:rFonts w:ascii="Times New Roman" w:hAnsi="Times New Roman"/>
-                <w:sz w:val="20"/>
-                <w:szCs w:val="20"/>
-              </w:rPr>
-              <w:t>36.3%</w:t>
+            <w:r>
+              <w:t>63.19%</w:t>
             </w:r>
           </w:p>
         </w:tc>
@@ -14458,17 +13795,8 @@
             </w:tcMar>
           </w:tcPr>
           <w:p>
-            <w:pPr>
-              <w:pStyle w:val="Body"/>
-              <w:jc w:val="center"/>
-            </w:pPr>
-            <w:r>
-              <w:rPr>
-                <w:rFonts w:ascii="Times New Roman" w:hAnsi="Times New Roman"/>
-                <w:sz w:val="20"/>
-                <w:szCs w:val="20"/>
-              </w:rPr>
-              <w:t>0.396</w:t>
+            <w:r>
+              <w:t>0.2703</w:t>
             </w:r>
           </w:p>
         </w:tc>
@@ -14530,17 +13858,8 @@
             </w:tcMar>
           </w:tcPr>
           <w:p>
-            <w:pPr>
-              <w:pStyle w:val="Body"/>
-              <w:jc w:val="center"/>
-            </w:pPr>
-            <w:r>
-              <w:rPr>
-                <w:rFonts w:ascii="Times New Roman" w:hAnsi="Times New Roman"/>
-                <w:sz w:val="20"/>
-                <w:szCs w:val="20"/>
-              </w:rPr>
-              <w:t>56.9%</w:t>
+            <w:r>
+              <w:t>68.71%</w:t>
             </w:r>
           </w:p>
         </w:tc>
@@ -14562,17 +13881,8 @@
             </w:tcMar>
           </w:tcPr>
           <w:p>
-            <w:pPr>
-              <w:pStyle w:val="Body"/>
-              <w:jc w:val="center"/>
-            </w:pPr>
-            <w:r>
-              <w:rPr>
-                <w:rFonts w:ascii="Times New Roman" w:hAnsi="Times New Roman"/>
-                <w:sz w:val="20"/>
-                <w:szCs w:val="20"/>
-              </w:rPr>
-              <w:t>0.110</w:t>
+            <w:r>
+              <w:t>0.5011</w:t>
             </w:r>
           </w:p>
         </w:tc>
@@ -14594,17 +13904,8 @@
             </w:tcMar>
           </w:tcPr>
           <w:p>
-            <w:pPr>
-              <w:pStyle w:val="Body"/>
-              <w:jc w:val="center"/>
-            </w:pPr>
-            <w:r>
-              <w:rPr>
-                <w:rFonts w:ascii="Times New Roman" w:hAnsi="Times New Roman"/>
-                <w:sz w:val="20"/>
-                <w:szCs w:val="20"/>
-              </w:rPr>
-              <w:t>0.0%</w:t>
+            <w:r>
+              <w:t>53.30%</w:t>
             </w:r>
           </w:p>
         </w:tc>
@@ -14626,17 +13927,8 @@
             </w:tcMar>
           </w:tcPr>
           <w:p>
-            <w:pPr>
-              <w:pStyle w:val="Body"/>
-              <w:jc w:val="center"/>
-            </w:pPr>
-            <w:r>
-              <w:rPr>
-                <w:rFonts w:ascii="Times New Roman" w:hAnsi="Times New Roman"/>
-                <w:sz w:val="20"/>
-                <w:szCs w:val="20"/>
-              </w:rPr>
-              <w:t>0.690</w:t>
+            <w:r>
+              <w:t>0.2284</w:t>
             </w:r>
           </w:p>
         </w:tc>
@@ -14698,17 +13990,8 @@
             </w:tcMar>
           </w:tcPr>
           <w:p>
-            <w:pPr>
-              <w:pStyle w:val="Body"/>
-              <w:jc w:val="center"/>
-            </w:pPr>
-            <w:r>
-              <w:rPr>
-                <w:rFonts w:ascii="Times New Roman" w:hAnsi="Times New Roman"/>
-                <w:sz w:val="20"/>
-                <w:szCs w:val="20"/>
-              </w:rPr>
-              <w:t>65.0%</w:t>
+            <w:r>
+              <w:t>85.42%</w:t>
             </w:r>
           </w:p>
         </w:tc>
@@ -14730,17 +14013,8 @@
             </w:tcMar>
           </w:tcPr>
           <w:p>
-            <w:pPr>
-              <w:pStyle w:val="Body"/>
-              <w:jc w:val="center"/>
-            </w:pPr>
-            <w:r>
-              <w:rPr>
-                <w:rFonts w:ascii="Times New Roman" w:hAnsi="Times New Roman"/>
-                <w:sz w:val="20"/>
-                <w:szCs w:val="20"/>
-              </w:rPr>
-              <w:t>0.472</w:t>
+            <w:r>
+              <w:t>0.7491</w:t>
             </w:r>
           </w:p>
         </w:tc>
@@ -14762,17 +14036,8 @@
             </w:tcMar>
           </w:tcPr>
           <w:p>
-            <w:pPr>
-              <w:pStyle w:val="Body"/>
-              <w:jc w:val="center"/>
-            </w:pPr>
-            <w:r>
-              <w:rPr>
-                <w:rFonts w:ascii="Times New Roman" w:hAnsi="Times New Roman"/>
-                <w:sz w:val="20"/>
-                <w:szCs w:val="20"/>
-              </w:rPr>
-              <w:t>58.8%</w:t>
+            <w:r>
+              <w:t>64.84%</w:t>
             </w:r>
           </w:p>
         </w:tc>
@@ -14794,17 +14059,8 @@
             </w:tcMar>
           </w:tcPr>
           <w:p>
-            <w:pPr>
-              <w:pStyle w:val="Body"/>
-              <w:jc w:val="center"/>
-            </w:pPr>
-            <w:r>
-              <w:rPr>
-                <w:rFonts w:ascii="Times New Roman" w:hAnsi="Times New Roman"/>
-                <w:sz w:val="20"/>
-                <w:szCs w:val="20"/>
-              </w:rPr>
-              <w:t>0.186</w:t>
+            <w:r>
+              <w:t>0.1838</w:t>
             </w:r>
           </w:p>
         </w:tc>
@@ -15118,17 +14374,8 @@
             </w:tcMar>
           </w:tcPr>
           <w:p>
-            <w:pPr>
-              <w:pStyle w:val="Body"/>
-              <w:jc w:val="center"/>
-            </w:pPr>
-            <w:r>
-              <w:rPr>
-                <w:rFonts w:ascii="Times New Roman" w:hAnsi="Times New Roman"/>
-                <w:sz w:val="20"/>
-                <w:szCs w:val="20"/>
-              </w:rPr>
-              <w:t>4.81</w:t>
+            <w:r>
+              <w:t>4.8807</w:t>
             </w:r>
           </w:p>
         </w:tc>
@@ -15150,16 +14397,30 @@
             </w:tcMar>
           </w:tcPr>
           <w:p>
-            <w:pPr>
-              <w:pStyle w:val="Body"/>
-              <w:jc w:val="center"/>
-            </w:pPr>
-            <w:r>
-              <w:rPr>
-                <w:rFonts w:ascii="Times New Roman" w:hAnsi="Times New Roman"/>
-                <w:sz w:val="20"/>
-                <w:szCs w:val="20"/>
-              </w:rPr>
+            <w:r>
+              <w:t>1.1275</w:t>
+            </w:r>
+          </w:p>
+        </w:tc>
+        <w:tc>
+          <w:tcPr>
+            <w:tcW w:w="1700" w:type="dxa"/>
+            <w:tcBorders>
+              <w:top w:val="single" w:sz="1" w:space="0" w:color="CCCCCC"/>
+              <w:left w:val="single" w:sz="1" w:space="0" w:color="CCCCCC"/>
+              <w:bottom w:val="single" w:sz="1" w:space="0" w:color="CCCCCC"/>
+              <w:right w:val="single" w:sz="1" w:space="0" w:color="CCCCCC"/>
+            </w:tcBorders>
+            <w:shd w:val="clear" w:color="auto" w:fill="F5F5F5"/>
+            <w:tcMar>
+              <w:top w:w="80" w:type="dxa"/>
+              <w:left w:w="80" w:type="dxa"/>
+              <w:bottom w:w="80" w:type="dxa"/>
+              <w:right w:w="80" w:type="dxa"/>
+            </w:tcMar>
+          </w:tcPr>
+          <w:p>
+            <w:r>
               <w:t>—</w:t>
             </w:r>
           </w:p>
@@ -15182,49 +14443,8 @@
             </w:tcMar>
           </w:tcPr>
           <w:p>
-            <w:pPr>
-              <w:pStyle w:val="Body"/>
-              <w:jc w:val="center"/>
-            </w:pPr>
-            <w:r>
-              <w:rPr>
-                <w:rFonts w:ascii="Times New Roman" w:hAnsi="Times New Roman"/>
-                <w:sz w:val="20"/>
-                <w:szCs w:val="20"/>
-              </w:rPr>
-              <w:t>—</w:t>
-            </w:r>
-          </w:p>
-        </w:tc>
-        <w:tc>
-          <w:tcPr>
-            <w:tcW w:w="1700" w:type="dxa"/>
-            <w:tcBorders>
-              <w:top w:val="single" w:sz="1" w:space="0" w:color="CCCCCC"/>
-              <w:left w:val="single" w:sz="1" w:space="0" w:color="CCCCCC"/>
-              <w:bottom w:val="single" w:sz="1" w:space="0" w:color="CCCCCC"/>
-              <w:right w:val="single" w:sz="1" w:space="0" w:color="CCCCCC"/>
-            </w:tcBorders>
-            <w:shd w:val="clear" w:color="auto" w:fill="F5F5F5"/>
-            <w:tcMar>
-              <w:top w:w="80" w:type="dxa"/>
-              <w:left w:w="80" w:type="dxa"/>
-              <w:bottom w:w="80" w:type="dxa"/>
-              <w:right w:w="80" w:type="dxa"/>
-            </w:tcMar>
-          </w:tcPr>
-          <w:p>
-            <w:pPr>
-              <w:pStyle w:val="Body"/>
-              <w:jc w:val="center"/>
-            </w:pPr>
-            <w:r>
-              <w:rPr>
-                <w:rFonts w:ascii="Times New Roman" w:hAnsi="Times New Roman"/>
-                <w:sz w:val="20"/>
-                <w:szCs w:val="20"/>
-              </w:rPr>
-              <w:t>0.194</w:t>
+            <w:r>
+              <w:t>0.2770</w:t>
             </w:r>
           </w:p>
         </w:tc>
@@ -15286,17 +14506,8 @@
             </w:tcMar>
           </w:tcPr>
           <w:p>
-            <w:pPr>
-              <w:pStyle w:val="Body"/>
-              <w:jc w:val="center"/>
-            </w:pPr>
-            <w:r>
-              <w:rPr>
-                <w:rFonts w:ascii="Times New Roman" w:hAnsi="Times New Roman"/>
-                <w:sz w:val="20"/>
-                <w:szCs w:val="20"/>
-              </w:rPr>
-              <w:t>7.94</w:t>
+            <w:r>
+              <w:t>4.3083</w:t>
             </w:r>
           </w:p>
         </w:tc>
@@ -15318,16 +14529,30 @@
             </w:tcMar>
           </w:tcPr>
           <w:p>
-            <w:pPr>
-              <w:pStyle w:val="Body"/>
-              <w:jc w:val="center"/>
-            </w:pPr>
-            <w:r>
-              <w:rPr>
-                <w:rFonts w:ascii="Times New Roman" w:hAnsi="Times New Roman"/>
-                <w:sz w:val="20"/>
-                <w:szCs w:val="20"/>
-              </w:rPr>
+            <w:r>
+              <w:t>1.0771</w:t>
+            </w:r>
+          </w:p>
+        </w:tc>
+        <w:tc>
+          <w:tcPr>
+            <w:tcW w:w="1700" w:type="dxa"/>
+            <w:tcBorders>
+              <w:top w:val="single" w:sz="1" w:space="0" w:color="CCCCCC"/>
+              <w:left w:val="single" w:sz="1" w:space="0" w:color="CCCCCC"/>
+              <w:bottom w:val="single" w:sz="1" w:space="0" w:color="CCCCCC"/>
+              <w:right w:val="single" w:sz="1" w:space="0" w:color="CCCCCC"/>
+            </w:tcBorders>
+            <w:shd w:val="clear" w:color="auto" w:fill="F5F5F5"/>
+            <w:tcMar>
+              <w:top w:w="80" w:type="dxa"/>
+              <w:left w:w="80" w:type="dxa"/>
+              <w:bottom w:w="80" w:type="dxa"/>
+              <w:right w:w="80" w:type="dxa"/>
+            </w:tcMar>
+          </w:tcPr>
+          <w:p>
+            <w:r>
               <w:t>—</w:t>
             </w:r>
           </w:p>
@@ -15350,49 +14575,8 @@
             </w:tcMar>
           </w:tcPr>
           <w:p>
-            <w:pPr>
-              <w:pStyle w:val="Body"/>
-              <w:jc w:val="center"/>
-            </w:pPr>
-            <w:r>
-              <w:rPr>
-                <w:rFonts w:ascii="Times New Roman" w:hAnsi="Times New Roman"/>
-                <w:sz w:val="20"/>
-                <w:szCs w:val="20"/>
-              </w:rPr>
-              <w:t>—</w:t>
-            </w:r>
-          </w:p>
-        </w:tc>
-        <w:tc>
-          <w:tcPr>
-            <w:tcW w:w="1700" w:type="dxa"/>
-            <w:tcBorders>
-              <w:top w:val="single" w:sz="1" w:space="0" w:color="CCCCCC"/>
-              <w:left w:val="single" w:sz="1" w:space="0" w:color="CCCCCC"/>
-              <w:bottom w:val="single" w:sz="1" w:space="0" w:color="CCCCCC"/>
-              <w:right w:val="single" w:sz="1" w:space="0" w:color="CCCCCC"/>
-            </w:tcBorders>
-            <w:shd w:val="clear" w:color="auto" w:fill="F5F5F5"/>
-            <w:tcMar>
-              <w:top w:w="80" w:type="dxa"/>
-              <w:left w:w="80" w:type="dxa"/>
-              <w:bottom w:w="80" w:type="dxa"/>
-              <w:right w:w="80" w:type="dxa"/>
-            </w:tcMar>
-          </w:tcPr>
-          <w:p>
-            <w:pPr>
-              <w:pStyle w:val="Body"/>
-              <w:jc w:val="center"/>
-            </w:pPr>
-            <w:r>
-              <w:rPr>
-                <w:rFonts w:ascii="Times New Roman" w:hAnsi="Times New Roman"/>
-                <w:sz w:val="20"/>
-                <w:szCs w:val="20"/>
-              </w:rPr>
-              <w:t>0.396</w:t>
+            <w:r>
+              <w:t>0.2703</w:t>
             </w:r>
           </w:p>
         </w:tc>
@@ -15454,17 +14638,8 @@
             </w:tcMar>
           </w:tcPr>
           <w:p>
-            <w:pPr>
-              <w:pStyle w:val="Body"/>
-              <w:jc w:val="center"/>
-            </w:pPr>
-            <w:r>
-              <w:rPr>
-                <w:rFonts w:ascii="Times New Roman" w:hAnsi="Times New Roman"/>
-                <w:sz w:val="20"/>
-                <w:szCs w:val="20"/>
-              </w:rPr>
-              <w:t>15.65</w:t>
+            <w:r>
+              <w:t>6.0644</w:t>
             </w:r>
           </w:p>
         </w:tc>
@@ -15486,16 +14661,30 @@
             </w:tcMar>
           </w:tcPr>
           <w:p>
-            <w:pPr>
-              <w:pStyle w:val="Body"/>
-              <w:jc w:val="center"/>
-            </w:pPr>
-            <w:r>
-              <w:rPr>
-                <w:rFonts w:ascii="Times New Roman" w:hAnsi="Times New Roman"/>
-                <w:sz w:val="20"/>
-                <w:szCs w:val="20"/>
-              </w:rPr>
+            <w:r>
+              <w:t>1.2001</w:t>
+            </w:r>
+          </w:p>
+        </w:tc>
+        <w:tc>
+          <w:tcPr>
+            <w:tcW w:w="1700" w:type="dxa"/>
+            <w:tcBorders>
+              <w:top w:val="single" w:sz="1" w:space="0" w:color="CCCCCC"/>
+              <w:left w:val="single" w:sz="1" w:space="0" w:color="CCCCCC"/>
+              <w:bottom w:val="single" w:sz="1" w:space="0" w:color="CCCCCC"/>
+              <w:right w:val="single" w:sz="1" w:space="0" w:color="CCCCCC"/>
+            </w:tcBorders>
+            <w:shd w:val="clear" w:color="auto" w:fill="F5F5F5"/>
+            <w:tcMar>
+              <w:top w:w="80" w:type="dxa"/>
+              <w:left w:w="80" w:type="dxa"/>
+              <w:bottom w:w="80" w:type="dxa"/>
+              <w:right w:w="80" w:type="dxa"/>
+            </w:tcMar>
+          </w:tcPr>
+          <w:p>
+            <w:r>
               <w:t>—</w:t>
             </w:r>
           </w:p>
@@ -15518,49 +14707,8 @@
             </w:tcMar>
           </w:tcPr>
           <w:p>
-            <w:pPr>
-              <w:pStyle w:val="Body"/>
-              <w:jc w:val="center"/>
-            </w:pPr>
-            <w:r>
-              <w:rPr>
-                <w:rFonts w:ascii="Times New Roman" w:hAnsi="Times New Roman"/>
-                <w:sz w:val="20"/>
-                <w:szCs w:val="20"/>
-              </w:rPr>
-              <w:t>—</w:t>
-            </w:r>
-          </w:p>
-        </w:tc>
-        <w:tc>
-          <w:tcPr>
-            <w:tcW w:w="1700" w:type="dxa"/>
-            <w:tcBorders>
-              <w:top w:val="single" w:sz="1" w:space="0" w:color="CCCCCC"/>
-              <w:left w:val="single" w:sz="1" w:space="0" w:color="CCCCCC"/>
-              <w:bottom w:val="single" w:sz="1" w:space="0" w:color="CCCCCC"/>
-              <w:right w:val="single" w:sz="1" w:space="0" w:color="CCCCCC"/>
-            </w:tcBorders>
-            <w:shd w:val="clear" w:color="auto" w:fill="F5F5F5"/>
-            <w:tcMar>
-              <w:top w:w="80" w:type="dxa"/>
-              <w:left w:w="80" w:type="dxa"/>
-              <w:bottom w:w="80" w:type="dxa"/>
-              <w:right w:w="80" w:type="dxa"/>
-            </w:tcMar>
-          </w:tcPr>
-          <w:p>
-            <w:pPr>
-              <w:pStyle w:val="Body"/>
-              <w:jc w:val="center"/>
-            </w:pPr>
-            <w:r>
-              <w:rPr>
-                <w:rFonts w:ascii="Times New Roman" w:hAnsi="Times New Roman"/>
-                <w:sz w:val="20"/>
-                <w:szCs w:val="20"/>
-              </w:rPr>
-              <w:t>0.690</w:t>
+            <w:r>
+              <w:t>0.2284</w:t>
             </w:r>
           </w:p>
         </w:tc>
@@ -15622,17 +14770,8 @@
             </w:tcMar>
           </w:tcPr>
           <w:p>
-            <w:pPr>
-              <w:pStyle w:val="Body"/>
-              <w:jc w:val="center"/>
-            </w:pPr>
-            <w:r>
-              <w:rPr>
-                <w:rFonts w:ascii="Times New Roman" w:hAnsi="Times New Roman"/>
-                <w:sz w:val="20"/>
-                <w:szCs w:val="20"/>
-              </w:rPr>
-              <w:t>5.53</w:t>
+            <w:r>
+              <w:t>3.4862</w:t>
             </w:r>
           </w:p>
         </w:tc>
@@ -15654,17 +14793,8 @@
             </w:tcMar>
           </w:tcPr>
           <w:p>
-            <w:pPr>
-              <w:pStyle w:val="Body"/>
-              <w:jc w:val="center"/>
-            </w:pPr>
-            <w:r>
-              <w:rPr>
-                <w:rFonts w:ascii="Times New Roman" w:hAnsi="Times New Roman"/>
-                <w:sz w:val="20"/>
-                <w:szCs w:val="20"/>
-              </w:rPr>
-              <w:t>~0</w:t>
+            <w:r>
+              <w:t>0.9156</w:t>
             </w:r>
           </w:p>
         </w:tc>
@@ -15686,17 +14816,8 @@
             </w:tcMar>
           </w:tcPr>
           <w:p>
-            <w:pPr>
-              <w:pStyle w:val="Body"/>
-              <w:jc w:val="center"/>
-            </w:pPr>
-            <w:r>
-              <w:rPr>
-                <w:rFonts w:ascii="Times New Roman" w:hAnsi="Times New Roman"/>
-                <w:sz w:val="20"/>
-                <w:szCs w:val="20"/>
-              </w:rPr>
-              <w:t>~0</w:t>
+            <w:r>
+              <w:t>—</w:t>
             </w:r>
           </w:p>
         </w:tc>
@@ -15718,17 +14839,8 @@
             </w:tcMar>
           </w:tcPr>
           <w:p>
-            <w:pPr>
-              <w:pStyle w:val="Body"/>
-              <w:jc w:val="center"/>
-            </w:pPr>
-            <w:r>
-              <w:rPr>
-                <w:rFonts w:ascii="Times New Roman" w:hAnsi="Times New Roman"/>
-                <w:sz w:val="20"/>
-                <w:szCs w:val="20"/>
-              </w:rPr>
-              <w:t>0.186</w:t>
+            <w:r>
+              <w:t>0.1838</w:t>
             </w:r>
           </w:p>
         </w:tc>
@@ -16161,13 +15273,90 @@
         </w:rPr>
       </w:pPr>
       <w:r>
+        <w:t xml:space="preserve"> Best Val Accuracy   : 85.42%</w:t>
+      </w:r>
+    </w:p>
+    <w:p>
+      <w:pPr>
+        <w:pStyle w:val="Body"/>
+        <w:shd w:val="clear" w:color="auto" w:fill="F0F0F0"/>
+        <w:spacing w:before="80" w:after="80"/>
+        <w:rPr>
+          <w:rFonts w:ascii="Times New Roman" w:eastAsia="Times New Roman" w:hAnsi="Times New Roman" w:cs="Times New Roman"/>
+        </w:rPr>
+      </w:pPr>
+      <w:r>
+        <w:t xml:space="preserve"> Macro F1            : 0.7491</w:t>
+      </w:r>
+    </w:p>
+    <w:p>
+      <w:pPr>
+        <w:pStyle w:val="Body"/>
+        <w:shd w:val="clear" w:color="auto" w:fill="F0F0F0"/>
+        <w:spacing w:before="80" w:after="80"/>
+        <w:rPr>
+          <w:rFonts w:ascii="Times New Roman" w:eastAsia="Times New Roman" w:hAnsi="Times New Roman" w:cs="Times New Roman"/>
+        </w:rPr>
+      </w:pPr>
+      <w:r>
+        <w:t xml:space="preserve"> Mean Sensitivity    : 0.7808</w:t>
+      </w:r>
+    </w:p>
+    <w:p>
+      <w:pPr>
+        <w:pStyle w:val="Body"/>
+        <w:shd w:val="clear" w:color="auto" w:fill="F0F0F0"/>
+        <w:spacing w:before="80" w:after="80"/>
+        <w:rPr>
+          <w:rFonts w:ascii="Times New Roman" w:eastAsia="Times New Roman" w:hAnsi="Times New Roman" w:cs="Times New Roman"/>
+        </w:rPr>
+      </w:pPr>
+      <w:r>
+        <w:t xml:space="preserve"> Mean Specificity    : 0.9623</w:t>
+      </w:r>
+    </w:p>
+    <w:p>
+      <w:pPr>
+        <w:pStyle w:val="Body"/>
+        <w:shd w:val="clear" w:color="auto" w:fill="F0F0F0"/>
+        <w:spacing w:before="80" w:after="80"/>
+        <w:rPr>
+          <w:rFonts w:ascii="Times New Roman" w:eastAsia="Times New Roman" w:hAnsi="Times New Roman" w:cs="Times New Roman"/>
+        </w:rPr>
+      </w:pPr>
+      <w:r>
+        <w:t xml:space="preserve"> Cohen Kappa         : 0.7163</w:t>
+      </w:r>
+    </w:p>
+    <w:p>
+      <w:pPr>
+        <w:pStyle w:val="Body"/>
+        <w:shd w:val="clear" w:color="auto" w:fill="F0F0F0"/>
+        <w:spacing w:before="80" w:after="80"/>
+        <w:rPr>
+          <w:rFonts w:ascii="Times New Roman" w:eastAsia="Times New Roman" w:hAnsi="Times New Roman" w:cs="Times New Roman"/>
+        </w:rPr>
+      </w:pPr>
+      <w:r>
+        <w:t xml:space="preserve"> ROC-AUC             : 0.9692</w:t>
+      </w:r>
+    </w:p>
+    <w:p>
+      <w:pPr>
+        <w:pStyle w:val="Body"/>
+        <w:shd w:val="clear" w:color="auto" w:fill="F0F0F0"/>
+        <w:spacing w:before="80" w:after="80"/>
+        <w:rPr>
+          <w:rFonts w:ascii="Times New Roman" w:eastAsia="Times New Roman" w:hAnsi="Times New Roman" w:cs="Times New Roman"/>
+        </w:rPr>
+      </w:pPr>
+      <w:r>
         <w:rPr>
           <w:rFonts w:ascii="Times New Roman" w:hAnsi="Times New Roman"/>
           <w:sz w:val="18"/>
           <w:szCs w:val="18"/>
         </w:rPr>
-        <w:lastRenderedPageBreak/>
-        <w:t xml:space="preserve"> Best Val Accuracy   : 65.00%</w:t>
+        <w:t>────────────────────────────────────────────────────────────</w:t>
       </w:r>
     </w:p>
     <w:p>
@@ -16180,13 +15369,7 @@
         </w:rPr>
       </w:pPr>
       <w:r>
-        <w:rPr>
-          <w:rFonts w:ascii="Times New Roman" w:hAnsi="Times New Roman"/>
-          <w:sz w:val="18"/>
-          <w:szCs w:val="18"/>
-          <w:lang w:val="it-IT"/>
-        </w:rPr>
-        <w:t xml:space="preserve"> Macro F1            : 0.4720</w:t>
+        <w:t xml:space="preserve"> NC1 (scatter)       : 3.486200</w:t>
       </w:r>
     </w:p>
     <w:p>
@@ -16199,12 +15382,7 @@
         </w:rPr>
       </w:pPr>
       <w:r>
-        <w:rPr>
-          <w:rFonts w:ascii="Times New Roman" w:hAnsi="Times New Roman"/>
-          <w:sz w:val="18"/>
-          <w:szCs w:val="18"/>
-        </w:rPr>
-        <w:t xml:space="preserve"> Mean Sensitivity    : 0.5880</w:t>
+        <w:t xml:space="preserve"> NC2 (ETF dev)       : 0.915600</w:t>
       </w:r>
     </w:p>
     <w:p>
@@ -16217,12 +15395,7 @@
         </w:rPr>
       </w:pPr>
       <w:r>
-        <w:rPr>
-          <w:rFonts w:ascii="Times New Roman" w:hAnsi="Times New Roman"/>
-          <w:sz w:val="18"/>
-          <w:szCs w:val="18"/>
-        </w:rPr>
-        <w:t xml:space="preserve"> Mean Specificity    : 0.9200</w:t>
+        <w:t xml:space="preserve"> NC3 (W-mu align)    : NaN</w:t>
       </w:r>
     </w:p>
     <w:p>
@@ -16235,124 +15408,7 @@
         </w:rPr>
       </w:pPr>
       <w:r>
-        <w:rPr>
-          <w:rFonts w:ascii="Times New Roman" w:hAnsi="Times New Roman"/>
-          <w:sz w:val="18"/>
-          <w:szCs w:val="18"/>
-          <w:lang w:val="de-DE"/>
-        </w:rPr>
-        <w:t xml:space="preserve"> Cohen Kappa         : 0.5100</w:t>
-      </w:r>
-    </w:p>
-    <w:p>
-      <w:pPr>
-        <w:pStyle w:val="Body"/>
-        <w:shd w:val="clear" w:color="auto" w:fill="F0F0F0"/>
-        <w:spacing w:before="80" w:after="80"/>
-        <w:rPr>
-          <w:rFonts w:ascii="Times New Roman" w:eastAsia="Times New Roman" w:hAnsi="Times New Roman" w:cs="Times New Roman"/>
-        </w:rPr>
-      </w:pPr>
-      <w:r>
-        <w:rPr>
-          <w:rFonts w:ascii="Times New Roman" w:hAnsi="Times New Roman"/>
-          <w:sz w:val="18"/>
-          <w:szCs w:val="18"/>
-        </w:rPr>
-        <w:t xml:space="preserve"> ROC-AUC             : 0.8900</w:t>
-      </w:r>
-    </w:p>
-    <w:p>
-      <w:pPr>
-        <w:pStyle w:val="Body"/>
-        <w:shd w:val="clear" w:color="auto" w:fill="F0F0F0"/>
-        <w:spacing w:before="80" w:after="80"/>
-        <w:rPr>
-          <w:rFonts w:ascii="Times New Roman" w:eastAsia="Times New Roman" w:hAnsi="Times New Roman" w:cs="Times New Roman"/>
-        </w:rPr>
-      </w:pPr>
-      <w:r>
-        <w:rPr>
-          <w:rFonts w:ascii="Times New Roman" w:hAnsi="Times New Roman"/>
-          <w:sz w:val="18"/>
-          <w:szCs w:val="18"/>
-        </w:rPr>
-        <w:t>────────────────────────────────────────────────────────────</w:t>
-      </w:r>
-    </w:p>
-    <w:p>
-      <w:pPr>
-        <w:pStyle w:val="Body"/>
-        <w:shd w:val="clear" w:color="auto" w:fill="F0F0F0"/>
-        <w:spacing w:before="80" w:after="80"/>
-        <w:rPr>
-          <w:rFonts w:ascii="Times New Roman" w:eastAsia="Times New Roman" w:hAnsi="Times New Roman" w:cs="Times New Roman"/>
-        </w:rPr>
-      </w:pPr>
-      <w:r>
-        <w:rPr>
-          <w:rFonts w:ascii="Times New Roman" w:hAnsi="Times New Roman"/>
-          <w:sz w:val="18"/>
-          <w:szCs w:val="18"/>
-          <w:lang w:val="it-IT"/>
-        </w:rPr>
-        <w:t xml:space="preserve"> NC1 (scatter)       : 5.530000</w:t>
-      </w:r>
-    </w:p>
-    <w:p>
-      <w:pPr>
-        <w:pStyle w:val="Body"/>
-        <w:shd w:val="clear" w:color="auto" w:fill="F0F0F0"/>
-        <w:spacing w:before="80" w:after="80"/>
-        <w:rPr>
-          <w:rFonts w:ascii="Times New Roman" w:eastAsia="Times New Roman" w:hAnsi="Times New Roman" w:cs="Times New Roman"/>
-        </w:rPr>
-      </w:pPr>
-      <w:r>
-        <w:rPr>
-          <w:rFonts w:ascii="Times New Roman" w:hAnsi="Times New Roman"/>
-          <w:sz w:val="18"/>
-          <w:szCs w:val="18"/>
-          <w:lang w:val="de-DE"/>
-        </w:rPr>
-        <w:t xml:space="preserve"> NC2 (ETF dev)       : 0.00000320</w:t>
-      </w:r>
-    </w:p>
-    <w:p>
-      <w:pPr>
-        <w:pStyle w:val="Body"/>
-        <w:shd w:val="clear" w:color="auto" w:fill="F0F0F0"/>
-        <w:spacing w:before="80" w:after="80"/>
-        <w:rPr>
-          <w:rFonts w:ascii="Times New Roman" w:eastAsia="Times New Roman" w:hAnsi="Times New Roman" w:cs="Times New Roman"/>
-        </w:rPr>
-      </w:pPr>
-      <w:r>
-        <w:rPr>
-          <w:rFonts w:ascii="Times New Roman" w:hAnsi="Times New Roman"/>
-          <w:sz w:val="18"/>
-          <w:szCs w:val="18"/>
-          <w:lang w:val="de-DE"/>
-        </w:rPr>
-        <w:t xml:space="preserve"> NC3 (W-mu align)    : 0.000000</w:t>
-      </w:r>
-    </w:p>
-    <w:p>
-      <w:pPr>
-        <w:pStyle w:val="Body"/>
-        <w:shd w:val="clear" w:color="auto" w:fill="F0F0F0"/>
-        <w:spacing w:before="80" w:after="80"/>
-        <w:rPr>
-          <w:rFonts w:ascii="Times New Roman" w:eastAsia="Times New Roman" w:hAnsi="Times New Roman" w:cs="Times New Roman"/>
-        </w:rPr>
-      </w:pPr>
-      <w:r>
-        <w:rPr>
-          <w:rFonts w:ascii="Times New Roman" w:hAnsi="Times New Roman"/>
-          <w:sz w:val="18"/>
-          <w:szCs w:val="18"/>
-        </w:rPr>
-        <w:t xml:space="preserve"> NC4 (NCC disagree)  : 0.186000</w:t>
+        <w:t xml:space="preserve"> NC4 (NCC disagree)  : 0.183800</w:t>
       </w:r>
     </w:p>
     <w:p>

</xml_diff>